<commit_message>
docs: align phase 1 contract with approved web scope
</commit_message>
<xml_diff>
--- a/docs/contracts/Hop_dong_phat_trien_ung_dung_Thong_tin_kinh_doanh_Web_GD1_TLB_NOV_RECO.docx
+++ b/docs/contracts/Hop_dong_phat_trien_ung_dung_Thong_tin_kinh_doanh_Web_GD1_TLB_NOV_RECO.docx
@@ -288,7 +288,61 @@
                 <w:rFonts w:ascii="Times New Roman" w:hAnsi="Times New Roman" w:eastAsia="Times New Roman"/>
                 <w:sz w:val="21"/>
               </w:rPr>
-              <w:t>Ông NGUYỄN TUẤN DŨNG - Người đại diện theo pháp luật</w:t>
+              <w:t>Ông NGUYỄN TUẤN DŨNG</w:t>
+            </w:r>
+          </w:p>
+        </w:tc>
+      </w:tr>
+      <w:tr>
+        <w:trPr>
+          <w:cantSplit/>
+        </w:trPr>
+        <w:tc>
+          <w:tcPr>
+            <w:tcW w:type="dxa" w:w="1871"/>
+            <w:tcMar>
+              <w:top w:w="70" w:type="dxa"/>
+              <w:start w:w="80" w:type="dxa"/>
+              <w:bottom w:w="70" w:type="dxa"/>
+              <w:end w:w="80" w:type="dxa"/>
+            </w:tcMar>
+            <w:vAlign w:val="center"/>
+          </w:tcPr>
+          <w:p>
+            <w:pPr>
+              <w:spacing w:after="0" w:line="240" w:lineRule="auto"/>
+            </w:pPr>
+            <w:r>
+              <w:rPr>
+                <w:rFonts w:ascii="Times New Roman" w:hAnsi="Times New Roman" w:eastAsia="Times New Roman"/>
+                <w:b/>
+                <w:sz w:val="21"/>
+              </w:rPr>
+              <w:t>Chức vụ</w:t>
+            </w:r>
+          </w:p>
+        </w:tc>
+        <w:tc>
+          <w:tcPr>
+            <w:tcW w:type="dxa" w:w="7370"/>
+            <w:tcMar>
+              <w:top w:w="70" w:type="dxa"/>
+              <w:start w:w="80" w:type="dxa"/>
+              <w:bottom w:w="70" w:type="dxa"/>
+              <w:end w:w="80" w:type="dxa"/>
+            </w:tcMar>
+            <w:vAlign w:val="center"/>
+          </w:tcPr>
+          <w:p>
+            <w:pPr>
+              <w:spacing w:after="0" w:line="240" w:lineRule="auto"/>
+            </w:pPr>
+            <w:r>
+              <w:rPr>
+                <w:rFonts w:ascii="Times New Roman" w:hAnsi="Times New Roman" w:eastAsia="Times New Roman"/>
+                <w:sz w:val="21"/>
+              </w:rPr>
+              <w:t>Giám đốc - Người đại diện theo pháp luật</w:t>
             </w:r>
           </w:p>
         </w:tc>
@@ -343,6 +397,114 @@
                 <w:sz w:val="21"/>
               </w:rPr>
               <w:t>0943 036 579</w:t>
+            </w:r>
+          </w:p>
+        </w:tc>
+      </w:tr>
+      <w:tr>
+        <w:trPr>
+          <w:cantSplit/>
+        </w:trPr>
+        <w:tc>
+          <w:tcPr>
+            <w:tcW w:type="dxa" w:w="1871"/>
+            <w:tcMar>
+              <w:top w:w="70" w:type="dxa"/>
+              <w:start w:w="80" w:type="dxa"/>
+              <w:bottom w:w="70" w:type="dxa"/>
+              <w:end w:w="80" w:type="dxa"/>
+            </w:tcMar>
+            <w:vAlign w:val="center"/>
+          </w:tcPr>
+          <w:p>
+            <w:pPr>
+              <w:spacing w:after="0" w:line="240" w:lineRule="auto"/>
+            </w:pPr>
+            <w:r>
+              <w:rPr>
+                <w:rFonts w:ascii="Times New Roman" w:hAnsi="Times New Roman" w:eastAsia="Times New Roman"/>
+                <w:b/>
+                <w:sz w:val="21"/>
+              </w:rPr>
+              <w:t>Tài khoản</w:t>
+            </w:r>
+          </w:p>
+        </w:tc>
+        <w:tc>
+          <w:tcPr>
+            <w:tcW w:type="dxa" w:w="7370"/>
+            <w:tcMar>
+              <w:top w:w="70" w:type="dxa"/>
+              <w:start w:w="80" w:type="dxa"/>
+              <w:bottom w:w="70" w:type="dxa"/>
+              <w:end w:w="80" w:type="dxa"/>
+            </w:tcMar>
+            <w:vAlign w:val="center"/>
+          </w:tcPr>
+          <w:p>
+            <w:pPr>
+              <w:spacing w:after="0" w:line="240" w:lineRule="auto"/>
+            </w:pPr>
+            <w:r>
+              <w:rPr>
+                <w:rFonts w:ascii="Times New Roman" w:hAnsi="Times New Roman" w:eastAsia="Times New Roman"/>
+                <w:sz w:val="21"/>
+              </w:rPr>
+              <w:t>84943036579 tại Ngân hàng TMCP Quân đội (MB)</w:t>
+            </w:r>
+          </w:p>
+        </w:tc>
+      </w:tr>
+      <w:tr>
+        <w:trPr>
+          <w:cantSplit/>
+        </w:trPr>
+        <w:tc>
+          <w:tcPr>
+            <w:tcW w:type="dxa" w:w="1871"/>
+            <w:tcMar>
+              <w:top w:w="70" w:type="dxa"/>
+              <w:start w:w="80" w:type="dxa"/>
+              <w:bottom w:w="70" w:type="dxa"/>
+              <w:end w:w="80" w:type="dxa"/>
+            </w:tcMar>
+            <w:vAlign w:val="center"/>
+          </w:tcPr>
+          <w:p>
+            <w:pPr>
+              <w:spacing w:after="0" w:line="240" w:lineRule="auto"/>
+            </w:pPr>
+            <w:r>
+              <w:rPr>
+                <w:rFonts w:ascii="Times New Roman" w:hAnsi="Times New Roman" w:eastAsia="Times New Roman"/>
+                <w:b/>
+                <w:sz w:val="21"/>
+              </w:rPr>
+              <w:t>Chủ tài khoản</w:t>
+            </w:r>
+          </w:p>
+        </w:tc>
+        <w:tc>
+          <w:tcPr>
+            <w:tcW w:type="dxa" w:w="7370"/>
+            <w:tcMar>
+              <w:top w:w="70" w:type="dxa"/>
+              <w:start w:w="80" w:type="dxa"/>
+              <w:bottom w:w="70" w:type="dxa"/>
+              <w:end w:w="80" w:type="dxa"/>
+            </w:tcMar>
+            <w:vAlign w:val="center"/>
+          </w:tcPr>
+          <w:p>
+            <w:pPr>
+              <w:spacing w:after="0" w:line="240" w:lineRule="auto"/>
+            </w:pPr>
+            <w:r>
+              <w:rPr>
+                <w:rFonts w:ascii="Times New Roman" w:hAnsi="Times New Roman" w:eastAsia="Times New Roman"/>
+                <w:sz w:val="21"/>
+              </w:rPr>
+              <w:t>CTY TNHH DICH VU GIAI TRI TLB</w:t>
             </w:r>
           </w:p>
         </w:tc>
@@ -579,7 +741,61 @@
                 <w:rFonts w:ascii="Times New Roman" w:hAnsi="Times New Roman" w:eastAsia="Times New Roman"/>
                 <w:sz w:val="21"/>
               </w:rPr>
-              <w:t>Ông NGUYỄN QUỐC HUY - Người đại diện theo pháp luật</w:t>
+              <w:t>Ông NGUYỄN QUỐC HUY</w:t>
+            </w:r>
+          </w:p>
+        </w:tc>
+      </w:tr>
+      <w:tr>
+        <w:trPr>
+          <w:cantSplit/>
+        </w:trPr>
+        <w:tc>
+          <w:tcPr>
+            <w:tcW w:type="dxa" w:w="1871"/>
+            <w:tcMar>
+              <w:top w:w="70" w:type="dxa"/>
+              <w:start w:w="80" w:type="dxa"/>
+              <w:bottom w:w="70" w:type="dxa"/>
+              <w:end w:w="80" w:type="dxa"/>
+            </w:tcMar>
+            <w:vAlign w:val="center"/>
+          </w:tcPr>
+          <w:p>
+            <w:pPr>
+              <w:spacing w:after="0" w:line="240" w:lineRule="auto"/>
+            </w:pPr>
+            <w:r>
+              <w:rPr>
+                <w:rFonts w:ascii="Times New Roman" w:hAnsi="Times New Roman" w:eastAsia="Times New Roman"/>
+                <w:b/>
+                <w:sz w:val="21"/>
+              </w:rPr>
+              <w:t>Chức vụ</w:t>
+            </w:r>
+          </w:p>
+        </w:tc>
+        <w:tc>
+          <w:tcPr>
+            <w:tcW w:type="dxa" w:w="7370"/>
+            <w:tcMar>
+              <w:top w:w="70" w:type="dxa"/>
+              <w:start w:w="80" w:type="dxa"/>
+              <w:bottom w:w="70" w:type="dxa"/>
+              <w:end w:w="80" w:type="dxa"/>
+            </w:tcMar>
+            <w:vAlign w:val="center"/>
+          </w:tcPr>
+          <w:p>
+            <w:pPr>
+              <w:spacing w:after="0" w:line="240" w:lineRule="auto"/>
+            </w:pPr>
+            <w:r>
+              <w:rPr>
+                <w:rFonts w:ascii="Times New Roman" w:hAnsi="Times New Roman" w:eastAsia="Times New Roman"/>
+                <w:sz w:val="21"/>
+              </w:rPr>
+              <w:t>Tổng Giám đốc - Người đại diện theo pháp luật</w:t>
             </w:r>
           </w:p>
         </w:tc>
@@ -669,7 +885,7 @@
         <w:rPr>
           <w:b w:val="0"/>
         </w:rPr>
-        <w:t>1.1. Bên A phân tích, thiết kế, lập trình, kiểm thử và bàn giao phiên bản Web của ứng dụng “Thông tin kinh doanh” cho Bên B. Mục tiêu là tập trung, chuẩn hóa và giúp nhân sự được phân quyền tra cứu, khai thác thông tin dự án phục vụ hoạt động kinh doanh.</w:t>
+        <w:t>1.1. Bên A phân tích, thiết kế, lập trình, kiểm thử và bàn giao phiên bản Web của ứng dụng “Thông tin kinh doanh” (RECO Sales Hub) cho Bên B. Giai đoạn 1 gồm trọn gói 14 hạng mục, 123 ngày công của 04 nhân sự thực hiện song song, được mô tả tại Phụ lục 01.</w:t>
       </w:r>
     </w:p>
     <w:p>
@@ -714,7 +930,7 @@
         <w:rPr>
           <w:b w:val="0"/>
         </w:rPr>
-        <w:t>2.1. Thời gian thực hiện: .......... ngày làm việc, kể từ ngày Hợp đồng có hiệu lực và Bên A nhận đủ khoản tạm ứng cùng dữ liệu đầu vào cần thiết.</w:t>
+        <w:t>2.1. Thời gian triển khai là 06 tuần dương lịch, gồm 01 tháng phát triển và 02 tuần kiểm thử, kể từ ngày Hợp đồng có hiệu lực, Bên A nhận đủ khoản tạm ứng và Bên B cung cấp đủ dữ liệu đầu vào cần thiết. Khối lượng 123 ngày công được thực hiện song song, không phải 123 ngày nối tiếp.</w:t>
       </w:r>
     </w:p>
     <w:p>
@@ -726,7 +942,7 @@
         <w:rPr>
           <w:b w:val="0"/>
         </w:rPr>
-        <w:t>2.2. Kế hoạch dự kiến gồm: (i) xác nhận yêu cầu và mẫu dữ liệu; (ii) thiết kế giao diện; (iii) phát triển; (iv) kiểm thử và chạy thử; (v) nghiệm thu, bàn giao.</w:t>
+        <w:t>2.2. Kế hoạch gồm: (i) xác nhận yêu cầu, dữ liệu và khóa phạm vi theo bản mô phỏng đã được duyệt; (ii) thiết kế và phát triển trong 01 tháng; (iii) kiểm thử, sửa lỗi và chạy thử trong 02 tuần; (iv) nghiệm thu, bàn giao; (v) bảo hành 02 tháng.</w:t>
       </w:r>
     </w:p>
     <w:p>
@@ -910,7 +1126,6 @@
                 <w:rFonts w:ascii="Times New Roman" w:hAnsi="Times New Roman" w:eastAsia="Times New Roman"/>
                 <w:sz w:val="21"/>
               </w:rPr>
-              <w:t>100%</w:t>
             </w:r>
           </w:p>
         </w:tc>
@@ -935,7 +1150,7 @@
                 <w:rFonts w:ascii="Times New Roman" w:hAnsi="Times New Roman" w:eastAsia="Times New Roman"/>
                 <w:sz w:val="21"/>
               </w:rPr>
-              <w:t>........................</w:t>
+              <w:t>83.240.741</w:t>
             </w:r>
           </w:p>
         </w:tc>
@@ -965,7 +1180,7 @@
                 <w:rFonts w:ascii="Times New Roman" w:hAnsi="Times New Roman" w:eastAsia="Times New Roman"/>
                 <w:sz w:val="21"/>
               </w:rPr>
-              <w:t>Thuế GTGT</w:t>
+              <w:t>Thuế GTGT 8%</w:t>
             </w:r>
           </w:p>
         </w:tc>
@@ -990,7 +1205,6 @@
                 <w:rFonts w:ascii="Times New Roman" w:hAnsi="Times New Roman" w:eastAsia="Times New Roman"/>
                 <w:sz w:val="21"/>
               </w:rPr>
-              <w:t>Theo quy định</w:t>
             </w:r>
           </w:p>
         </w:tc>
@@ -1015,7 +1229,7 @@
                 <w:rFonts w:ascii="Times New Roman" w:hAnsi="Times New Roman" w:eastAsia="Times New Roman"/>
                 <w:sz w:val="21"/>
               </w:rPr>
-              <w:t>........................</w:t>
+              <w:t>6.659.259</w:t>
             </w:r>
           </w:p>
         </w:tc>
@@ -1072,6 +1286,7 @@
                 <w:b/>
                 <w:sz w:val="21"/>
               </w:rPr>
+              <w:t>100%</w:t>
             </w:r>
           </w:p>
         </w:tc>
@@ -1097,7 +1312,7 @@
                 <w:b/>
                 <w:sz w:val="21"/>
               </w:rPr>
-              <w:t>........................</w:t>
+              <w:t>89.900.000</w:t>
             </w:r>
           </w:p>
         </w:tc>
@@ -1111,7 +1326,7 @@
         <w:rPr>
           <w:b w:val="0"/>
         </w:rPr>
-        <w:t>Bằng chữ: ............................................................................................................................</w:t>
+        <w:t>Bằng chữ: Tám mươi chín triệu chín trăm nghìn đồng chẵn.</w:t>
       </w:r>
     </w:p>
     <w:p>
@@ -1147,7 +1362,19 @@
         <w:rPr>
           <w:b w:val="0"/>
         </w:rPr>
-        <w:t>3.3. Phí dịch vụ hạ tầng, tên miền, chứng thư số, tin nhắn, thư điện tử, kho lưu trữ hoặc dịch vụ của bên thứ ba (nếu có) do Bên B trực tiếp chi trả hoặc thanh toán bổ sung theo chứng từ được hai bên thống nhất.</w:t>
+        <w:t>3.3. Giá trị trên là giá trọn gói sau ưu đãi 30%, đã gồm thuế GTGT 8% và 02 tháng bảo hành. Dịch vụ bảo trì sau bảo hành không thuộc giá trị Hợp đồng. Giá không thay đổi do Bên B không sử dụng một phần hạng mục đã đặt hàng, trừ khi hai bên có thỏa thuận khác bằng văn bản.</w:t>
+      </w:r>
+    </w:p>
+    <w:p>
+      <w:pPr>
+        <w:spacing w:before="0" w:after="60"/>
+        <w:ind w:firstLine="369"/>
+      </w:pPr>
+      <w:r>
+        <w:rPr>
+          <w:b w:val="0"/>
+        </w:rPr>
+        <w:t>3.4. Máy chủ, tên miền, lưu trữ, sao lưu, tài khoản Google/Apple, dịch vụ gửi tin và dịch vụ bên thứ ba không nằm trong giá trị Hợp đồng; Bên B đứng tên và thanh toán trực tiếp hoặc hoàn trả theo chứng từ nếu ủy quyền Bên A mua hộ.</w:t>
       </w:r>
     </w:p>
     <w:p>
@@ -1204,7 +1431,19 @@
         <w:rPr>
           <w:b w:val="0"/>
         </w:rPr>
-        <w:t>4.4. Bảo hành 60 ngày kể từ ngày nghiệm thu đối với lỗi lập trình thuộc phạm vi Hợp đồng. Bảo hành không bao gồm yêu cầu mới, dữ liệu sai, can thiệp trái phép, lỗi hạ tầng/bên thứ ba hoặc thay đổi do Bên B tự thực hiện.</w:t>
+        <w:t>4.4. Bên A bảo hành sản phẩm trong 02 tháng kể từ ngày ký biên bản nghiệm thu đối với lỗi phần mềm làm chức năng hoạt động sai so với Phụ lục 01. Bảo hành không bao gồm tính năng mới, thay đổi nghiệp vụ/giao diện, nhập liệu, lỗi dữ liệu, hạ tầng hoặc dịch vụ bên thứ ba, và lỗi do Bên B hoặc bên thứ ba can thiệp. Các nội dung này được xử lý theo cơ chế phát sinh tại Điều 4.5.</w:t>
+      </w:r>
+    </w:p>
+    <w:p>
+      <w:pPr>
+        <w:spacing w:before="0" w:after="60"/>
+        <w:ind w:firstLine="369"/>
+      </w:pPr>
+      <w:r>
+        <w:rPr>
+          <w:b w:val="0"/>
+        </w:rPr>
+        <w:t>4.5. Với yêu cầu phát sinh, Bên A phân tích và gửi dự toán theo ngày công: quản lý dự án/phân tích nghiệp vụ 1.100.000 đồng/ngày; xây dựng sản phẩm 880.000 đồng/ngày; kiểm thử 700.000 đồng/ngày, chưa gồm thuế GTGT. Khối lượng tối thiểu 0,5 ngày cho mỗi yêu cầu; công việc ngoài giờ theo yêu cầu của Bên B tính 150% đơn giá. Chỉ thực hiện sau khi Bên B chấp thuận phạm vi, chi phí và tiến độ bằng văn bản hoặc thư điện tử.</w:t>
       </w:r>
     </w:p>
     <w:p>
@@ -1763,6 +2002,7 @@
       </w:tblGrid>
       <w:tr>
         <w:trPr>
+          <w:tblHeader w:val="true"/>
           <w:cantSplit/>
         </w:trPr>
         <w:tc>
@@ -1892,7 +2132,7 @@
                 <w:rFonts w:ascii="Times New Roman" w:hAnsi="Times New Roman" w:eastAsia="Times New Roman"/>
                 <w:sz w:val="21"/>
               </w:rPr>
-              <w:t>Đăng nhập và phân quyền</w:t>
+              <w:t>Hạ tầng kỹ thuật</w:t>
             </w:r>
           </w:p>
         </w:tc>
@@ -1916,7 +2156,7 @@
                 <w:rFonts w:ascii="Times New Roman" w:hAnsi="Times New Roman" w:eastAsia="Times New Roman"/>
                 <w:sz w:val="21"/>
               </w:rPr>
-              <w:t>Đăng nhập/đăng xuất; đổi mật khẩu; quản lý tài khoản và trạng thái; giới hạn chức năng, dữ liệu theo nhóm quyền.</w:t>
+              <w:t>Kho mã nguồn, kiểm tra tự động, môi trường phát triển, kiểm thử và chạy thật; cấu hình sao lưu ở mức ứng dụng.</w:t>
             </w:r>
           </w:p>
         </w:tc>
@@ -1969,7 +2209,7 @@
                 <w:rFonts w:ascii="Times New Roman" w:hAnsi="Times New Roman" w:eastAsia="Times New Roman"/>
                 <w:sz w:val="21"/>
               </w:rPr>
-              <w:t>Danh mục dự án</w:t>
+              <w:t>Thiết kế giao diện</w:t>
             </w:r>
           </w:p>
         </w:tc>
@@ -1993,7 +2233,7 @@
                 <w:rFonts w:ascii="Times New Roman" w:hAnsi="Times New Roman" w:eastAsia="Times New Roman"/>
                 <w:sz w:val="21"/>
               </w:rPr>
-              <w:t>Danh sách dự án; ảnh đại diện; trạng thái; khu vực/nhóm phân loại; sắp xếp và phân trang.</w:t>
+              <w:t>Trang đầu; trang dự án với 08 khu vực; catalog; mẫu soạn tin 02 cột; cây tài liệu và thành phần dùng chung, hiển thị thích ứng.</w:t>
             </w:r>
           </w:p>
         </w:tc>
@@ -2046,7 +2286,7 @@
                 <w:rFonts w:ascii="Times New Roman" w:hAnsi="Times New Roman" w:eastAsia="Times New Roman"/>
                 <w:sz w:val="21"/>
               </w:rPr>
-              <w:t>Chi tiết thông tin kinh doanh</w:t>
+              <w:t>Mô hình dữ liệu</w:t>
             </w:r>
           </w:p>
         </w:tc>
@@ -2070,7 +2310,7 @@
                 <w:rFonts w:ascii="Times New Roman" w:hAnsi="Times New Roman" w:eastAsia="Times New Roman"/>
                 <w:sz w:val="21"/>
               </w:rPr>
-              <w:t>Tên dự án, giới thiệu, vị trí, điểm nổi bật, thông tin sản phẩm/chính sách do RECO cung cấp; nội dung có cấu trúc để nhân sự dễ đọc và sử dụng.</w:t>
+              <w:t>Dự án; cây phân khu, tòa/dãy, tầng, căn/lô; mẫu nội dung; tài liệu và thẻ liên kết.</w:t>
             </w:r>
           </w:p>
         </w:tc>
@@ -2123,7 +2363,7 @@
                 <w:rFonts w:ascii="Times New Roman" w:hAnsi="Times New Roman" w:eastAsia="Times New Roman"/>
                 <w:sz w:val="21"/>
               </w:rPr>
-              <w:t>Thư viện nội dung</w:t>
+              <w:t>Xác thực và phiên</w:t>
             </w:r>
           </w:p>
         </w:tc>
@@ -2147,7 +2387,7 @@
                 <w:rFonts w:ascii="Times New Roman" w:hAnsi="Times New Roman" w:eastAsia="Times New Roman"/>
                 <w:sz w:val="21"/>
               </w:rPr>
-              <w:t>Quản lý ảnh, tệp và liên kết theo dự án; xem/tải xuống theo quyền. Dữ liệu mẫu có thể gồm bài giới thiệu và hình ảnh Celestine Westlake do Bên B cung cấp.</w:t>
+              <w:t>Đăng nhập bằng số điện thoại hoặc thư điện tử kèm mật khẩu; đăng xuất, đổi mật khẩu và quản lý phiên sử dụng.</w:t>
             </w:r>
           </w:p>
         </w:tc>
@@ -2200,7 +2440,7 @@
                 <w:rFonts w:ascii="Times New Roman" w:hAnsi="Times New Roman" w:eastAsia="Times New Roman"/>
                 <w:sz w:val="21"/>
               </w:rPr>
-              <w:t>Tìm kiếm và lọc</w:t>
+              <w:t>Phân quyền</w:t>
             </w:r>
           </w:p>
         </w:tc>
@@ -2224,7 +2464,7 @@
                 <w:rFonts w:ascii="Times New Roman" w:hAnsi="Times New Roman" w:eastAsia="Times New Roman"/>
                 <w:sz w:val="21"/>
               </w:rPr>
-              <w:t>Tìm theo từ khóa; lọc theo dự án, khu vực, trạng thái hoặc nhóm thông tin có trong dữ liệu.</w:t>
+              <w:t>Vai trò người dùng; nhãn nội dung; phạm vi dự án được giao; kiểm soát quyền xem, tạo, sửa và duyệt.</w:t>
             </w:r>
           </w:p>
         </w:tc>
@@ -2277,7 +2517,7 @@
                 <w:rFonts w:ascii="Times New Roman" w:hAnsi="Times New Roman" w:eastAsia="Times New Roman"/>
                 <w:sz w:val="21"/>
               </w:rPr>
-              <w:t>Quản trị nội dung</w:t>
+              <w:t>Quản trị dự án và tài liệu</w:t>
             </w:r>
           </w:p>
         </w:tc>
@@ -2301,7 +2541,7 @@
                 <w:rFonts w:ascii="Times New Roman" w:hAnsi="Times New Roman" w:eastAsia="Times New Roman"/>
                 <w:sz w:val="21"/>
               </w:rPr>
-              <w:t>Tạo, xem, sửa, ẩn/hiện và sắp xếp dự án, nội dung, ảnh/tệp; kiểm tra các trường dữ liệu bắt buộc.</w:t>
+              <w:t>Hồ sơ dự án theo 08 khu vực; Drive ngoài chỉ lưu thẻ URL; cây 07 nhánh để duyệt và tra cứu nguồn.</w:t>
             </w:r>
           </w:p>
         </w:tc>
@@ -2354,7 +2594,7 @@
                 <w:rFonts w:ascii="Times New Roman" w:hAnsi="Times New Roman" w:eastAsia="Times New Roman"/>
                 <w:sz w:val="21"/>
               </w:rPr>
-              <w:t>Theo dõi cơ bản</w:t>
+              <w:t>Cây sản phẩm và catalog</w:t>
             </w:r>
           </w:p>
         </w:tc>
@@ -2378,7 +2618,546 @@
                 <w:rFonts w:ascii="Times New Roman" w:hAnsi="Times New Roman" w:eastAsia="Times New Roman"/>
                 <w:sz w:val="21"/>
               </w:rPr>
-              <w:t>Lưu thời điểm tạo/cập nhật và người thực hiện đối với bản ghi chính; không bao gồm hệ thống kiểm toán chuyên sâu.</w:t>
+              <w:t>Quản lý phân khu, tòa/dãy, tầng, căn/lô; catalog có tìm kiếm, lọc và chi tiết căn/lô không hiển thị giá.</w:t>
+            </w:r>
+          </w:p>
+        </w:tc>
+      </w:tr>
+      <w:tr>
+        <w:trPr>
+          <w:cantSplit/>
+        </w:trPr>
+        <w:tc>
+          <w:tcPr>
+            <w:tcW w:type="dxa" w:w="3343"/>
+            <w:tcMar>
+              <w:top w:w="70" w:type="dxa"/>
+              <w:start w:w="80" w:type="dxa"/>
+              <w:bottom w:w="70" w:type="dxa"/>
+              <w:end w:w="80" w:type="dxa"/>
+            </w:tcMar>
+            <w:vAlign w:val="center"/>
+          </w:tcPr>
+          <w:p>
+            <w:pPr>
+              <w:spacing w:after="0" w:line="240" w:lineRule="auto"/>
+            </w:pPr>
+            <w:r>
+              <w:rPr>
+                <w:rFonts w:ascii="Times New Roman" w:hAnsi="Times New Roman" w:eastAsia="Times New Roman"/>
+                <w:sz w:val="21"/>
+              </w:rPr>
+              <w:t>8</w:t>
+            </w:r>
+          </w:p>
+        </w:tc>
+        <w:tc>
+          <w:tcPr>
+            <w:tcW w:type="dxa" w:w="3343"/>
+            <w:tcMar>
+              <w:top w:w="70" w:type="dxa"/>
+              <w:start w:w="80" w:type="dxa"/>
+              <w:bottom w:w="70" w:type="dxa"/>
+              <w:end w:w="80" w:type="dxa"/>
+            </w:tcMar>
+            <w:vAlign w:val="center"/>
+          </w:tcPr>
+          <w:p>
+            <w:pPr>
+              <w:spacing w:after="0" w:line="240" w:lineRule="auto"/>
+            </w:pPr>
+            <w:r>
+              <w:rPr>
+                <w:rFonts w:ascii="Times New Roman" w:hAnsi="Times New Roman" w:eastAsia="Times New Roman"/>
+                <w:sz w:val="21"/>
+              </w:rPr>
+              <w:t>Sản phẩm nổi bật</w:t>
+            </w:r>
+          </w:p>
+        </w:tc>
+        <w:tc>
+          <w:tcPr>
+            <w:tcW w:type="dxa" w:w="3343"/>
+            <w:tcMar>
+              <w:top w:w="70" w:type="dxa"/>
+              <w:start w:w="80" w:type="dxa"/>
+              <w:bottom w:w="70" w:type="dxa"/>
+              <w:end w:w="80" w:type="dxa"/>
+            </w:tcMar>
+            <w:vAlign w:val="center"/>
+          </w:tcPr>
+          <w:p>
+            <w:pPr>
+              <w:spacing w:after="0" w:line="240" w:lineRule="auto"/>
+            </w:pPr>
+            <w:r>
+              <w:rPr>
+                <w:rFonts w:ascii="Times New Roman" w:hAnsi="Times New Roman" w:eastAsia="Times New Roman"/>
+                <w:sz w:val="21"/>
+              </w:rPr>
+              <w:t>Slider SP Hot tại Trang đầu và trang dự án; thẻ nội dung bán hàng, không có trường giá.</w:t>
+            </w:r>
+          </w:p>
+        </w:tc>
+      </w:tr>
+      <w:tr>
+        <w:trPr>
+          <w:cantSplit/>
+        </w:trPr>
+        <w:tc>
+          <w:tcPr>
+            <w:tcW w:type="dxa" w:w="3343"/>
+            <w:tcMar>
+              <w:top w:w="70" w:type="dxa"/>
+              <w:start w:w="80" w:type="dxa"/>
+              <w:bottom w:w="70" w:type="dxa"/>
+              <w:end w:w="80" w:type="dxa"/>
+            </w:tcMar>
+            <w:vAlign w:val="center"/>
+          </w:tcPr>
+          <w:p>
+            <w:pPr>
+              <w:spacing w:after="0" w:line="240" w:lineRule="auto"/>
+            </w:pPr>
+            <w:r>
+              <w:rPr>
+                <w:rFonts w:ascii="Times New Roman" w:hAnsi="Times New Roman" w:eastAsia="Times New Roman"/>
+                <w:sz w:val="21"/>
+              </w:rPr>
+              <w:t>9</w:t>
+            </w:r>
+          </w:p>
+        </w:tc>
+        <w:tc>
+          <w:tcPr>
+            <w:tcW w:type="dxa" w:w="3343"/>
+            <w:tcMar>
+              <w:top w:w="70" w:type="dxa"/>
+              <w:start w:w="80" w:type="dxa"/>
+              <w:bottom w:w="70" w:type="dxa"/>
+              <w:end w:w="80" w:type="dxa"/>
+            </w:tcMar>
+            <w:vAlign w:val="center"/>
+          </w:tcPr>
+          <w:p>
+            <w:pPr>
+              <w:spacing w:after="0" w:line="240" w:lineRule="auto"/>
+            </w:pPr>
+            <w:r>
+              <w:rPr>
+                <w:rFonts w:ascii="Times New Roman" w:hAnsi="Times New Roman" w:eastAsia="Times New Roman"/>
+                <w:sz w:val="21"/>
+              </w:rPr>
+              <w:t>Thư viện mẫu</w:t>
+            </w:r>
+          </w:p>
+        </w:tc>
+        <w:tc>
+          <w:tcPr>
+            <w:tcW w:type="dxa" w:w="3343"/>
+            <w:tcMar>
+              <w:top w:w="70" w:type="dxa"/>
+              <w:start w:w="80" w:type="dxa"/>
+              <w:bottom w:w="70" w:type="dxa"/>
+              <w:end w:w="80" w:type="dxa"/>
+            </w:tcMar>
+            <w:vAlign w:val="center"/>
+          </w:tcPr>
+          <w:p>
+            <w:pPr>
+              <w:spacing w:after="0" w:line="240" w:lineRule="auto"/>
+            </w:pPr>
+            <w:r>
+              <w:rPr>
+                <w:rFonts w:ascii="Times New Roman" w:hAnsi="Times New Roman" w:eastAsia="Times New Roman"/>
+                <w:sz w:val="21"/>
+              </w:rPr>
+              <w:t>Kho mẫu dùng chung phải duyệt và kho cá nhân; lọc theo dự án/căn; tìm kiếm theo tiêu đề.</w:t>
+            </w:r>
+          </w:p>
+        </w:tc>
+      </w:tr>
+      <w:tr>
+        <w:trPr>
+          <w:cantSplit/>
+        </w:trPr>
+        <w:tc>
+          <w:tcPr>
+            <w:tcW w:type="dxa" w:w="3343"/>
+            <w:tcMar>
+              <w:top w:w="70" w:type="dxa"/>
+              <w:start w:w="80" w:type="dxa"/>
+              <w:bottom w:w="70" w:type="dxa"/>
+              <w:end w:w="80" w:type="dxa"/>
+            </w:tcMar>
+            <w:vAlign w:val="center"/>
+          </w:tcPr>
+          <w:p>
+            <w:pPr>
+              <w:spacing w:after="0" w:line="240" w:lineRule="auto"/>
+            </w:pPr>
+            <w:r>
+              <w:rPr>
+                <w:rFonts w:ascii="Times New Roman" w:hAnsi="Times New Roman" w:eastAsia="Times New Roman"/>
+                <w:sz w:val="21"/>
+              </w:rPr>
+              <w:t>10</w:t>
+            </w:r>
+          </w:p>
+        </w:tc>
+        <w:tc>
+          <w:tcPr>
+            <w:tcW w:type="dxa" w:w="3343"/>
+            <w:tcMar>
+              <w:top w:w="70" w:type="dxa"/>
+              <w:start w:w="80" w:type="dxa"/>
+              <w:bottom w:w="70" w:type="dxa"/>
+              <w:end w:w="80" w:type="dxa"/>
+            </w:tcMar>
+            <w:vAlign w:val="center"/>
+          </w:tcPr>
+          <w:p>
+            <w:pPr>
+              <w:spacing w:after="0" w:line="240" w:lineRule="auto"/>
+            </w:pPr>
+            <w:r>
+              <w:rPr>
+                <w:rFonts w:ascii="Times New Roman" w:hAnsi="Times New Roman" w:eastAsia="Times New Roman"/>
+                <w:sz w:val="21"/>
+              </w:rPr>
+              <w:t>Soạn và chia sẻ tin</w:t>
+            </w:r>
+          </w:p>
+        </w:tc>
+        <w:tc>
+          <w:tcPr>
+            <w:tcW w:type="dxa" w:w="3343"/>
+            <w:tcMar>
+              <w:top w:w="70" w:type="dxa"/>
+              <w:start w:w="80" w:type="dxa"/>
+              <w:bottom w:w="70" w:type="dxa"/>
+              <w:end w:w="80" w:type="dxa"/>
+            </w:tcMar>
+            <w:vAlign w:val="center"/>
+          </w:tcPr>
+          <w:p>
+            <w:pPr>
+              <w:spacing w:after="0" w:line="240" w:lineRule="auto"/>
+            </w:pPr>
+            <w:r>
+              <w:rPr>
+                <w:rFonts w:ascii="Times New Roman" w:hAnsi="Times New Roman" w:eastAsia="Times New Roman"/>
+                <w:sz w:val="21"/>
+              </w:rPr>
+              <w:t>Màn hình 02 cột; sao chép nội dung và đường dẫn; mở kênh để người dùng dán thủ công; không tự điền hoặc tự đăng.</w:t>
+            </w:r>
+          </w:p>
+        </w:tc>
+      </w:tr>
+      <w:tr>
+        <w:trPr>
+          <w:cantSplit/>
+        </w:trPr>
+        <w:tc>
+          <w:tcPr>
+            <w:tcW w:type="dxa" w:w="3343"/>
+            <w:tcMar>
+              <w:top w:w="70" w:type="dxa"/>
+              <w:start w:w="80" w:type="dxa"/>
+              <w:bottom w:w="70" w:type="dxa"/>
+              <w:end w:w="80" w:type="dxa"/>
+            </w:tcMar>
+            <w:vAlign w:val="center"/>
+          </w:tcPr>
+          <w:p>
+            <w:pPr>
+              <w:spacing w:after="0" w:line="240" w:lineRule="auto"/>
+            </w:pPr>
+            <w:r>
+              <w:rPr>
+                <w:rFonts w:ascii="Times New Roman" w:hAnsi="Times New Roman" w:eastAsia="Times New Roman"/>
+                <w:sz w:val="21"/>
+              </w:rPr>
+              <w:t>11</w:t>
+            </w:r>
+          </w:p>
+        </w:tc>
+        <w:tc>
+          <w:tcPr>
+            <w:tcW w:type="dxa" w:w="3343"/>
+            <w:tcMar>
+              <w:top w:w="70" w:type="dxa"/>
+              <w:start w:w="80" w:type="dxa"/>
+              <w:bottom w:w="70" w:type="dxa"/>
+              <w:end w:w="80" w:type="dxa"/>
+            </w:tcMar>
+            <w:vAlign w:val="center"/>
+          </w:tcPr>
+          <w:p>
+            <w:pPr>
+              <w:spacing w:after="0" w:line="240" w:lineRule="auto"/>
+            </w:pPr>
+            <w:r>
+              <w:rPr>
+                <w:rFonts w:ascii="Times New Roman" w:hAnsi="Times New Roman" w:eastAsia="Times New Roman"/>
+                <w:sz w:val="21"/>
+              </w:rPr>
+              <w:t>Duyệt mẫu</w:t>
+            </w:r>
+          </w:p>
+        </w:tc>
+        <w:tc>
+          <w:tcPr>
+            <w:tcW w:type="dxa" w:w="3343"/>
+            <w:tcMar>
+              <w:top w:w="70" w:type="dxa"/>
+              <w:start w:w="80" w:type="dxa"/>
+              <w:bottom w:w="70" w:type="dxa"/>
+              <w:end w:w="80" w:type="dxa"/>
+            </w:tcMar>
+            <w:vAlign w:val="center"/>
+          </w:tcPr>
+          <w:p>
+            <w:pPr>
+              <w:spacing w:after="0" w:line="240" w:lineRule="auto"/>
+            </w:pPr>
+            <w:r>
+              <w:rPr>
+                <w:rFonts w:ascii="Times New Roman" w:hAnsi="Times New Roman" w:eastAsia="Times New Roman"/>
+                <w:sz w:val="21"/>
+              </w:rPr>
+              <w:t>Luồng đề xuất và duyệt mẫu dùng chung; nội dung cá nhân giữ riêng theo chủ sở hữu.</w:t>
+            </w:r>
+          </w:p>
+        </w:tc>
+      </w:tr>
+      <w:tr>
+        <w:trPr>
+          <w:cantSplit/>
+        </w:trPr>
+        <w:tc>
+          <w:tcPr>
+            <w:tcW w:type="dxa" w:w="3343"/>
+            <w:tcMar>
+              <w:top w:w="70" w:type="dxa"/>
+              <w:start w:w="80" w:type="dxa"/>
+              <w:bottom w:w="70" w:type="dxa"/>
+              <w:end w:w="80" w:type="dxa"/>
+            </w:tcMar>
+            <w:vAlign w:val="center"/>
+          </w:tcPr>
+          <w:p>
+            <w:pPr>
+              <w:spacing w:after="0" w:line="240" w:lineRule="auto"/>
+            </w:pPr>
+            <w:r>
+              <w:rPr>
+                <w:rFonts w:ascii="Times New Roman" w:hAnsi="Times New Roman" w:eastAsia="Times New Roman"/>
+                <w:sz w:val="21"/>
+              </w:rPr>
+              <w:t>12</w:t>
+            </w:r>
+          </w:p>
+        </w:tc>
+        <w:tc>
+          <w:tcPr>
+            <w:tcW w:type="dxa" w:w="3343"/>
+            <w:tcMar>
+              <w:top w:w="70" w:type="dxa"/>
+              <w:start w:w="80" w:type="dxa"/>
+              <w:bottom w:w="70" w:type="dxa"/>
+              <w:end w:w="80" w:type="dxa"/>
+            </w:tcMar>
+            <w:vAlign w:val="center"/>
+          </w:tcPr>
+          <w:p>
+            <w:pPr>
+              <w:spacing w:after="0" w:line="240" w:lineRule="auto"/>
+            </w:pPr>
+            <w:r>
+              <w:rPr>
+                <w:rFonts w:ascii="Times New Roman" w:hAnsi="Times New Roman" w:eastAsia="Times New Roman"/>
+                <w:sz w:val="21"/>
+              </w:rPr>
+              <w:t>Kiểm thử</w:t>
+            </w:r>
+          </w:p>
+        </w:tc>
+        <w:tc>
+          <w:tcPr>
+            <w:tcW w:type="dxa" w:w="3343"/>
+            <w:tcMar>
+              <w:top w:w="70" w:type="dxa"/>
+              <w:start w:w="80" w:type="dxa"/>
+              <w:bottom w:w="70" w:type="dxa"/>
+              <w:end w:w="80" w:type="dxa"/>
+            </w:tcMar>
+            <w:vAlign w:val="center"/>
+          </w:tcPr>
+          <w:p>
+            <w:pPr>
+              <w:spacing w:after="0" w:line="240" w:lineRule="auto"/>
+            </w:pPr>
+            <w:r>
+              <w:rPr>
+                <w:rFonts w:ascii="Times New Roman" w:hAnsi="Times New Roman" w:eastAsia="Times New Roman"/>
+                <w:sz w:val="21"/>
+              </w:rPr>
+              <w:t>Kiểm thử quyền theo vai trò, luồng chính, biên nội dung công khai, hiển thị Web và lỗi trước bàn giao.</w:t>
+            </w:r>
+          </w:p>
+        </w:tc>
+      </w:tr>
+      <w:tr>
+        <w:trPr>
+          <w:cantSplit/>
+        </w:trPr>
+        <w:tc>
+          <w:tcPr>
+            <w:tcW w:type="dxa" w:w="3343"/>
+            <w:tcMar>
+              <w:top w:w="70" w:type="dxa"/>
+              <w:start w:w="80" w:type="dxa"/>
+              <w:bottom w:w="70" w:type="dxa"/>
+              <w:end w:w="80" w:type="dxa"/>
+            </w:tcMar>
+            <w:vAlign w:val="center"/>
+          </w:tcPr>
+          <w:p>
+            <w:pPr>
+              <w:spacing w:after="0" w:line="240" w:lineRule="auto"/>
+            </w:pPr>
+            <w:r>
+              <w:rPr>
+                <w:rFonts w:ascii="Times New Roman" w:hAnsi="Times New Roman" w:eastAsia="Times New Roman"/>
+                <w:sz w:val="21"/>
+              </w:rPr>
+              <w:t>13</w:t>
+            </w:r>
+          </w:p>
+        </w:tc>
+        <w:tc>
+          <w:tcPr>
+            <w:tcW w:type="dxa" w:w="3343"/>
+            <w:tcMar>
+              <w:top w:w="70" w:type="dxa"/>
+              <w:start w:w="80" w:type="dxa"/>
+              <w:bottom w:w="70" w:type="dxa"/>
+              <w:end w:w="80" w:type="dxa"/>
+            </w:tcMar>
+            <w:vAlign w:val="center"/>
+          </w:tcPr>
+          <w:p>
+            <w:pPr>
+              <w:spacing w:after="0" w:line="240" w:lineRule="auto"/>
+            </w:pPr>
+            <w:r>
+              <w:rPr>
+                <w:rFonts w:ascii="Times New Roman" w:hAnsi="Times New Roman" w:eastAsia="Times New Roman"/>
+                <w:sz w:val="21"/>
+              </w:rPr>
+              <w:t>Dữ liệu mẫu và đào tạo</w:t>
+            </w:r>
+          </w:p>
+        </w:tc>
+        <w:tc>
+          <w:tcPr>
+            <w:tcW w:type="dxa" w:w="3343"/>
+            <w:tcMar>
+              <w:top w:w="70" w:type="dxa"/>
+              <w:start w:w="80" w:type="dxa"/>
+              <w:bottom w:w="70" w:type="dxa"/>
+              <w:end w:w="80" w:type="dxa"/>
+            </w:tcMar>
+            <w:vAlign w:val="center"/>
+          </w:tcPr>
+          <w:p>
+            <w:pPr>
+              <w:spacing w:after="0" w:line="240" w:lineRule="auto"/>
+            </w:pPr>
+            <w:r>
+              <w:rPr>
+                <w:rFonts w:ascii="Times New Roman" w:hAnsi="Times New Roman" w:eastAsia="Times New Roman"/>
+                <w:sz w:val="21"/>
+              </w:rPr>
+              <w:t>Cấu hình một bộ dữ liệu mẫu; hướng dẫn nhập liệu; 01 buổi đào tạo và bàn giao cho đầu mối Bên B.</w:t>
+            </w:r>
+          </w:p>
+        </w:tc>
+      </w:tr>
+      <w:tr>
+        <w:trPr>
+          <w:cantSplit/>
+        </w:trPr>
+        <w:tc>
+          <w:tcPr>
+            <w:tcW w:type="dxa" w:w="3343"/>
+            <w:tcMar>
+              <w:top w:w="70" w:type="dxa"/>
+              <w:start w:w="80" w:type="dxa"/>
+              <w:bottom w:w="70" w:type="dxa"/>
+              <w:end w:w="80" w:type="dxa"/>
+            </w:tcMar>
+            <w:vAlign w:val="center"/>
+          </w:tcPr>
+          <w:p>
+            <w:pPr>
+              <w:spacing w:after="0" w:line="240" w:lineRule="auto"/>
+            </w:pPr>
+            <w:r>
+              <w:rPr>
+                <w:rFonts w:ascii="Times New Roman" w:hAnsi="Times New Roman" w:eastAsia="Times New Roman"/>
+                <w:sz w:val="21"/>
+              </w:rPr>
+              <w:t>14</w:t>
+            </w:r>
+          </w:p>
+        </w:tc>
+        <w:tc>
+          <w:tcPr>
+            <w:tcW w:type="dxa" w:w="3343"/>
+            <w:tcMar>
+              <w:top w:w="70" w:type="dxa"/>
+              <w:start w:w="80" w:type="dxa"/>
+              <w:bottom w:w="70" w:type="dxa"/>
+              <w:end w:w="80" w:type="dxa"/>
+            </w:tcMar>
+            <w:vAlign w:val="center"/>
+          </w:tcPr>
+          <w:p>
+            <w:pPr>
+              <w:spacing w:after="0" w:line="240" w:lineRule="auto"/>
+            </w:pPr>
+            <w:r>
+              <w:rPr>
+                <w:rFonts w:ascii="Times New Roman" w:hAnsi="Times New Roman" w:eastAsia="Times New Roman"/>
+                <w:sz w:val="21"/>
+              </w:rPr>
+              <w:t>Quản lý dự án</w:t>
+            </w:r>
+          </w:p>
+        </w:tc>
+        <w:tc>
+          <w:tcPr>
+            <w:tcW w:type="dxa" w:w="3343"/>
+            <w:tcMar>
+              <w:top w:w="70" w:type="dxa"/>
+              <w:start w:w="80" w:type="dxa"/>
+              <w:bottom w:w="70" w:type="dxa"/>
+              <w:end w:w="80" w:type="dxa"/>
+            </w:tcMar>
+            <w:vAlign w:val="center"/>
+          </w:tcPr>
+          <w:p>
+            <w:pPr>
+              <w:spacing w:after="0" w:line="240" w:lineRule="auto"/>
+            </w:pPr>
+            <w:r>
+              <w:rPr>
+                <w:rFonts w:ascii="Times New Roman" w:hAnsi="Times New Roman" w:eastAsia="Times New Roman"/>
+                <w:sz w:val="21"/>
+              </w:rPr>
+              <w:t>Họp, báo cáo tiến độ, quản lý yêu cầu và phối hợp trong 06 tuần triển khai.</w:t>
             </w:r>
           </w:p>
         </w:tc>
@@ -2573,7 +3352,22 @@
         <w:t xml:space="preserve">- </w:t>
       </w:r>
       <w:r>
-        <w:t>Giai đoạn 1 không bao gồm: CRM/quản lý khách hàng và giao dịch; báo cáo BI nâng cao; AI; đăng bài mạng xã hội; tích hợp ERP, sàn bất động sản, bản đồ trả phí, SMS/Zalo; ứng dụng di động; vận hành hạ tầng dài hạn.</w:t>
+        <w:t>Giai đoạn 1 không bao gồm: phiếu tính giá và lưới bảng hàng làm mô hình; bộ hỏi đáp 88 câu; kịch bản bán hàng MH-12; mẫu riêng từng kênh, lịch đăng hoặc tự đăng; báo cáo vận hành đầy đủ; nhập nội dung trực tiếp từ Google Drive; ứng dụng iOS/Android; CRM, giao dịch, doanh thu, hoa hồng, AI và các chức năng Giai đoạn 2.</w:t>
+      </w:r>
+    </w:p>
+    <w:p>
+      <w:pPr>
+        <w:spacing w:after="40"/>
+        <w:ind w:left="369" w:hanging="198"/>
+      </w:pPr>
+      <w:r>
+        <w:rPr>
+          <w:b/>
+        </w:rPr>
+        <w:t xml:space="preserve">- </w:t>
+      </w:r>
+      <w:r>
+        <w:t>Các mục ngoài phạm vi nhưng đã thể hiện trong bản mô phỏng chỉ nhằm minh họa định hướng, không phải sản phẩm phải bàn giao theo Hợp đồng.</w:t>
       </w:r>
     </w:p>
     <w:p>
@@ -2597,6 +3391,7 @@
       </w:tblGrid>
       <w:tr>
         <w:trPr>
+          <w:tblHeader w:val="true"/>
           <w:cantSplit/>
         </w:trPr>
         <w:tc>
@@ -3873,9 +4668,6 @@
     <w:rsid w:val="00FC693F"/>
     <w:pPr>
       <w:keepNext/>
-      <w:pBdr>
-        <w:bottom w:val="single" w:sz="8" w:space="4" w:color="4F81BD" w:themeColor="accent1"/>
-      </w:pBdr>
       <w:spacing w:after="60" w:line="240" w:lineRule="auto" w:before="140"/>
       <w:contextualSpacing/>
     </w:pPr>

</xml_diff>

<commit_message>
docs: simplify acceptance and revise payment schedule
</commit_message>
<xml_diff>
--- a/docs/contracts/Hop_dong_phat_trien_ung_dung_Thong_tin_kinh_doanh_Web_GD1_TLB_NOV_RECO.docx
+++ b/docs/contracts/Hop_dong_phat_trien_ung_dung_Thong_tin_kinh_doanh_Web_GD1_TLB_NOV_RECO.docx
@@ -1338,7 +1338,7 @@
         <w:rPr>
           <w:b w:val="0"/>
         </w:rPr>
-        <w:t>3.1. Thanh toán theo 03 đợt: (a) 30% trong 03 ngày làm việc từ ngày ký Hợp đồng; (b) 40% sau khi Bên B xác nhận bản chạy thử; (c) 30% còn lại và thuế GTGT trong 05 ngày làm việc kể từ khi nhận đủ biên bản nghiệm thu và hóa đơn GTGT hợp lệ.</w:t>
+        <w:t>3.1. Thanh toán theo 03 đợt trên tổng giá trị Hợp đồng đã gồm thuế GTGT: (a) Đợt 1: 35%, tương đương 31.465.000 đồng, trong 03 ngày làm việc từ ngày ký Hợp đồng; (b) Đợt 2: 35%, tương đương 31.465.000 đồng, sau khi Bên A hoàn thành phiên bản chạy thử và Bên B xác nhận qua văn bản hoặc thư điện tử; (c) Đợt 3: 30%, tương đương 26.970.000 đồng, trong 05 ngày làm việc kể từ khi hai bên ký biên bản nghiệm thu và Bên B nhận được hóa đơn GTGT hợp lệ.</w:t>
       </w:r>
     </w:p>
     <w:p>
@@ -1395,7 +1395,7 @@
         <w:rPr>
           <w:b w:val="0"/>
         </w:rPr>
-        <w:t>4.1. Bên A thông báo khi sản phẩm sẵn sàng nghiệm thu. Trong 05 ngày làm việc, Bên B kiểm tra theo Phụ lục 01 và gửi một danh sách lỗi/ý kiến tổng hợp. Lỗi là trường hợp chức năng không vận hành đúng mô tả đã thống nhất; yêu cầu mới hoặc thay đổi cách vận hành không được coi là lỗi.</w:t>
+        <w:t>4.1. Bên A bàn giao phiên bản Web để Bên B kiểm tra. Trong 05 ngày làm việc, Bên B xác nhận nghiệm thu hoặc gửi một danh sách lỗi tổng hợp. Bên A khắc phục các lỗi thuộc phạm vi đã thỏa thuận. Yêu cầu mới hoặc thay đổi cách vận hành không được coi là lỗi.</w:t>
       </w:r>
     </w:p>
     <w:p>
@@ -1407,7 +1407,7 @@
         <w:rPr>
           <w:b w:val="0"/>
         </w:rPr>
-        <w:t>4.2. Bên A khắc phục lỗi thuộc phạm vi và gửi lại để xác nhận. Sản phẩm được nghiệm thu khi hai bên ký biên bản nghiệm thu hoặc khi hết thời hạn nêu trên mà Bên B không gửi ý kiến bằng văn bản và sản phẩm đã được đưa vào sử dụng thực tế.</w:t>
+        <w:t>4.2. Hai bên chỉ lập 01 Biên bản nghiệm thu. Các lỗi nhỏ không ảnh hưởng đến việc sử dụng không làm trì hoãn nghiệm thu và được ghi trong Biên bản để Bên A xử lý trong thời gian bảo hành. Nếu hết thời hạn tại Điều 4.1 mà Bên B không có ý kiến bằng văn bản và đã sử dụng sản phẩm thì sản phẩm được coi là đã nghiệm thu.</w:t>
       </w:r>
     </w:p>
     <w:p>
@@ -3298,7 +3298,7 @@
         <w:t xml:space="preserve">- </w:t>
       </w:r>
       <w:r>
-        <w:t>Biên bản nghiệm thu; danh sách lỗi còn lại (nếu có) và thời hạn khắc phục được hai bên xác nhận.</w:t>
+        <w:t>01 Biên bản nghiệm thu; lỗi nhỏ còn lại và thời hạn khắc phục (nếu có) được ghi trực tiếp trong Biên bản.</w:t>
       </w:r>
     </w:p>
     <w:p>

</xml_diff>

<commit_message>
docs: leave contract signing details blank
</commit_message>
<xml_diff>
--- a/docs/contracts/Hop_dong_phat_trien_ung_dung_Thong_tin_kinh_doanh_Web_GD1_TLB_NOV_RECO.docx
+++ b/docs/contracts/Hop_dong_phat_trien_ung_dung_Thong_tin_kinh_doanh_Web_GD1_TLB_NOV_RECO.docx
@@ -288,7 +288,7 @@
                 <w:rFonts w:ascii="Times New Roman" w:hAnsi="Times New Roman" w:eastAsia="Times New Roman"/>
                 <w:sz w:val="21"/>
               </w:rPr>
-              <w:t>Ông NGUYỄN TUẤN DŨNG</w:t>
+              <w:t>Ông/Bà: ........................................................</w:t>
             </w:r>
           </w:p>
         </w:tc>
@@ -342,7 +342,7 @@
                 <w:rFonts w:ascii="Times New Roman" w:hAnsi="Times New Roman" w:eastAsia="Times New Roman"/>
                 <w:sz w:val="21"/>
               </w:rPr>
-              <w:t>Giám đốc - Người đại diện theo pháp luật</w:t>
+              <w:t>.................................................................</w:t>
             </w:r>
           </w:p>
         </w:tc>
@@ -741,7 +741,7 @@
                 <w:rFonts w:ascii="Times New Roman" w:hAnsi="Times New Roman" w:eastAsia="Times New Roman"/>
                 <w:sz w:val="21"/>
               </w:rPr>
-              <w:t>Ông NGUYỄN QUỐC HUY</w:t>
+              <w:t>Ông/Bà: ........................................................</w:t>
             </w:r>
           </w:p>
         </w:tc>
@@ -795,7 +795,7 @@
                 <w:rFonts w:ascii="Times New Roman" w:hAnsi="Times New Roman" w:eastAsia="Times New Roman"/>
                 <w:sz w:val="21"/>
               </w:rPr>
-              <w:t>Tổng Giám đốc - Người đại diện theo pháp luật</w:t>
+              <w:t>.................................................................</w:t>
             </w:r>
           </w:p>
         </w:tc>
@@ -1839,7 +1839,7 @@
                 <w:b/>
                 <w:sz w:val="21"/>
               </w:rPr>
-              <w:t>NGUYỄN TUẤN DŨNG</w:t>
+              <w:t>........................................</w:t>
             </w:r>
           </w:p>
         </w:tc>
@@ -1897,7 +1897,7 @@
                 <w:b/>
                 <w:sz w:val="21"/>
               </w:rPr>
-              <w:t>NGUYỄN QUỐC HUY</w:t>
+              <w:t>........................................</w:t>
             </w:r>
           </w:p>
         </w:tc>
@@ -3784,7 +3784,7 @@
                 <w:b/>
                 <w:sz w:val="21"/>
               </w:rPr>
-              <w:t>NGUYỄN TUẤN DŨNG</w:t>
+              <w:t>........................................</w:t>
             </w:r>
           </w:p>
         </w:tc>
@@ -3839,7 +3839,7 @@
                 <w:b/>
                 <w:sz w:val="21"/>
               </w:rPr>
-              <w:t>NGUYỄN QUỐC HUY</w:t>
+              <w:t>........................................</w:t>
             </w:r>
           </w:p>
         </w:tc>

</xml_diff>

<commit_message>
docs: expand phase 1 functional scope appendix
</commit_message>
<xml_diff>
--- a/docs/contracts/Hop_dong_phat_trien_ung_dung_Thong_tin_kinh_doanh_Web_GD1_TLB_NOV_RECO.docx
+++ b/docs/contracts/Hop_dong_phat_trien_ung_dung_Thong_tin_kinh_doanh_Web_GD1_TLB_NOV_RECO.docx
@@ -2542,7 +2542,14 @@
         <w:rPr>
           <w:rFonts w:ascii="Times New Roman" w:hAnsi="Times New Roman" w:cs="Times New Roman"/>
         </w:rPr>
-        <w:t>2. CÁC PHÂN HỆ GIAI ĐOẠN 1</w:t>
+      </w:r>
+      <w:r>
+        <w:rPr>
+          <w:rFonts w:ascii="Arial" w:hAnsi="Arial" w:eastAsia="Arial"/>
+          <w:b/>
+          <w:sz w:val="24"/>
+        </w:rPr>
+        <w:t>2. DANH MỤC CHỨC NĂNG GIAI ĐOẠN 1</w:t>
       </w:r>
     </w:p>
     <w:tbl>
@@ -2551,42 +2558,52 @@
         <w:jc w:val="center"/>
         <w:tblLayout w:type="fixed"/>
         <w:tblLook w:val="04A0" w:firstRow="1" w:lastRow="0" w:firstColumn="1" w:lastColumn="0" w:noHBand="0" w:noVBand="1"/>
+        <w:tblBorders>
+          <w:top w:val="single" w:sz="4" w:color="D9D9D9"/>
+          <w:left w:val="single" w:sz="4" w:color="D9D9D9"/>
+          <w:bottom w:val="single" w:sz="4" w:color="D9D9D9"/>
+          <w:right w:val="single" w:sz="4" w:color="D9D9D9"/>
+          <w:insideH w:val="single" w:sz="4" w:color="D9D9D9"/>
+          <w:insideV w:val="single" w:sz="4" w:color="D9D9D9"/>
+        </w:tblBorders>
       </w:tblPr>
       <w:tblGrid>
-        <w:gridCol w:w="3343"/>
-        <w:gridCol w:w="3343"/>
-        <w:gridCol w:w="3343"/>
+        <w:gridCol w:w="624"/>
+        <w:gridCol w:w="2494"/>
+        <w:gridCol w:w="6406"/>
       </w:tblGrid>
       <w:tr>
         <w:trPr>
           <w:cantSplit/>
           <w:tblHeader/>
           <w:jc w:val="center"/>
+          <w:tblHeader w:val="true"/>
         </w:trPr>
         <w:tc>
           <w:tcPr>
-            <w:tcW w:w="3343" w:type="dxa"/>
+            <w:tcW w:w="624" w:type="dxa"/>
             <w:shd w:val="clear" w:color="auto" w:fill="D9EAF7"/>
             <w:tcMar>
-              <w:top w:w="70" w:type="dxa"/>
+              <w:top w:w="90" w:type="dxa"/>
               <w:left w:w="80" w:type="dxa"/>
-              <w:bottom w:w="70" w:type="dxa"/>
+              <w:bottom w:w="90" w:type="dxa"/>
               <w:right w:w="80" w:type="dxa"/>
+              <w:start w:w="110" w:type="dxa"/>
+              <w:end w:w="110" w:type="dxa"/>
             </w:tcMar>
             <w:vAlign w:val="center"/>
           </w:tcPr>
           <w:p>
             <w:pPr>
-              <w:spacing w:after="0" w:line="240" w:lineRule="auto"/>
-              <w:rPr>
-                <w:rFonts w:cs="Times New Roman"/>
-              </w:rPr>
+              <w:spacing w:before="0" w:after="0" w:line="252" w:lineRule="auto"/>
+              <w:jc w:val="center"/>
             </w:pPr>
+            <w:r/>
             <w:r>
               <w:rPr>
-                <w:rFonts w:cs="Times New Roman"/>
+                <w:rFonts w:ascii="Times New Roman" w:hAnsi="Times New Roman" w:eastAsia="Times New Roman"/>
                 <w:b/>
-                <w:sz w:val="21"/>
+                <w:sz w:val="18"/>
               </w:rPr>
               <w:t>STT</w:t>
             </w:r>
@@ -2594,59 +2611,61 @@
         </w:tc>
         <w:tc>
           <w:tcPr>
-            <w:tcW w:w="3343" w:type="dxa"/>
+            <w:tcW w:w="2494" w:type="dxa"/>
             <w:shd w:val="clear" w:color="auto" w:fill="D9EAF7"/>
             <w:tcMar>
-              <w:top w:w="70" w:type="dxa"/>
+              <w:top w:w="90" w:type="dxa"/>
               <w:left w:w="80" w:type="dxa"/>
-              <w:bottom w:w="70" w:type="dxa"/>
+              <w:bottom w:w="90" w:type="dxa"/>
               <w:right w:w="80" w:type="dxa"/>
+              <w:start w:w="110" w:type="dxa"/>
+              <w:end w:w="110" w:type="dxa"/>
             </w:tcMar>
             <w:vAlign w:val="center"/>
           </w:tcPr>
           <w:p>
             <w:pPr>
-              <w:spacing w:after="0" w:line="240" w:lineRule="auto"/>
-              <w:rPr>
-                <w:rFonts w:cs="Times New Roman"/>
-              </w:rPr>
+              <w:spacing w:before="0" w:after="0" w:line="252" w:lineRule="auto"/>
+              <w:jc w:val="center"/>
             </w:pPr>
+            <w:r/>
             <w:r>
               <w:rPr>
-                <w:rFonts w:cs="Times New Roman"/>
+                <w:rFonts w:ascii="Times New Roman" w:hAnsi="Times New Roman" w:eastAsia="Times New Roman"/>
                 <w:b/>
-                <w:sz w:val="21"/>
-              </w:rPr>
-              <w:t>Phân hệ</w:t>
+                <w:sz w:val="18"/>
+              </w:rPr>
+              <w:t>Module</w:t>
             </w:r>
           </w:p>
         </w:tc>
         <w:tc>
           <w:tcPr>
-            <w:tcW w:w="3343" w:type="dxa"/>
+            <w:tcW w:w="6406" w:type="dxa"/>
             <w:shd w:val="clear" w:color="auto" w:fill="D9EAF7"/>
             <w:tcMar>
-              <w:top w:w="70" w:type="dxa"/>
+              <w:top w:w="90" w:type="dxa"/>
               <w:left w:w="80" w:type="dxa"/>
-              <w:bottom w:w="70" w:type="dxa"/>
+              <w:bottom w:w="90" w:type="dxa"/>
               <w:right w:w="80" w:type="dxa"/>
+              <w:start w:w="110" w:type="dxa"/>
+              <w:end w:w="110" w:type="dxa"/>
             </w:tcMar>
             <w:vAlign w:val="center"/>
           </w:tcPr>
           <w:p>
             <w:pPr>
-              <w:spacing w:after="0" w:line="240" w:lineRule="auto"/>
-              <w:rPr>
-                <w:rFonts w:cs="Times New Roman"/>
-              </w:rPr>
+              <w:spacing w:before="0" w:after="0" w:line="252" w:lineRule="auto"/>
+              <w:jc w:val="center"/>
             </w:pPr>
+            <w:r/>
             <w:r>
               <w:rPr>
-                <w:rFonts w:cs="Times New Roman"/>
+                <w:rFonts w:ascii="Times New Roman" w:hAnsi="Times New Roman" w:eastAsia="Times New Roman"/>
                 <w:b/>
-                <w:sz w:val="21"/>
-              </w:rPr>
-              <w:t>Nội dung tối thiểu</w:t>
+                <w:sz w:val="18"/>
+              </w:rPr>
+              <w:t>Chức năng trong phạm vi</w:t>
             </w:r>
           </w:p>
         </w:tc>
@@ -2654,30 +2673,29 @@
       <w:tr>
         <w:trPr>
           <w:cantSplit/>
-          <w:jc w:val="center"/>
         </w:trPr>
         <w:tc>
           <w:tcPr>
-            <w:tcW w:w="3343" w:type="dxa"/>
+            <w:tcW w:type="dxa" w:w="624"/>
+            <w:vAlign w:val="center"/>
             <w:tcMar>
-              <w:top w:w="70" w:type="dxa"/>
-              <w:left w:w="80" w:type="dxa"/>
-              <w:bottom w:w="70" w:type="dxa"/>
-              <w:right w:w="80" w:type="dxa"/>
+              <w:top w:w="90" w:type="dxa"/>
+              <w:start w:w="110" w:type="dxa"/>
+              <w:bottom w:w="90" w:type="dxa"/>
+              <w:end w:w="110" w:type="dxa"/>
             </w:tcMar>
-            <w:vAlign w:val="center"/>
           </w:tcPr>
           <w:p>
             <w:pPr>
-              <w:spacing w:after="0" w:line="240" w:lineRule="auto"/>
-              <w:rPr>
-                <w:rFonts w:cs="Times New Roman"/>
-              </w:rPr>
+              <w:spacing w:before="0" w:after="0" w:line="252" w:lineRule="auto"/>
+              <w:jc w:val="center"/>
             </w:pPr>
+            <w:r/>
             <w:r>
               <w:rPr>
-                <w:rFonts w:cs="Times New Roman"/>
-                <w:sz w:val="21"/>
+                <w:rFonts w:ascii="Times New Roman" w:hAnsi="Times New Roman" w:eastAsia="Times New Roman"/>
+                <w:b w:val="0"/>
+                <w:sz w:val="18"/>
               </w:rPr>
               <w:t>1</w:t>
             </w:r>
@@ -2685,55 +2703,55 @@
         </w:tc>
         <w:tc>
           <w:tcPr>
-            <w:tcW w:w="3343" w:type="dxa"/>
+            <w:tcW w:type="dxa" w:w="2494"/>
+            <w:vAlign w:val="center"/>
             <w:tcMar>
-              <w:top w:w="70" w:type="dxa"/>
-              <w:left w:w="80" w:type="dxa"/>
-              <w:bottom w:w="70" w:type="dxa"/>
-              <w:right w:w="80" w:type="dxa"/>
+              <w:top w:w="90" w:type="dxa"/>
+              <w:start w:w="110" w:type="dxa"/>
+              <w:bottom w:w="90" w:type="dxa"/>
+              <w:end w:w="110" w:type="dxa"/>
             </w:tcMar>
-            <w:vAlign w:val="center"/>
           </w:tcPr>
           <w:p>
             <w:pPr>
-              <w:spacing w:after="0" w:line="240" w:lineRule="auto"/>
-              <w:rPr>
-                <w:rFonts w:cs="Times New Roman"/>
-              </w:rPr>
+              <w:spacing w:before="0" w:after="0" w:line="252" w:lineRule="auto"/>
+              <w:jc w:val="left"/>
             </w:pPr>
+            <w:r/>
             <w:r>
               <w:rPr>
-                <w:rFonts w:cs="Times New Roman"/>
-                <w:sz w:val="21"/>
-              </w:rPr>
-              <w:t>Hạ tầng kỹ thuật</w:t>
+                <w:rFonts w:ascii="Times New Roman" w:hAnsi="Times New Roman" w:eastAsia="Times New Roman"/>
+                <w:b/>
+                <w:sz w:val="18"/>
+              </w:rPr>
+              <w:t>Nền tảng Web và hạ tầng kỹ thuật</w:t>
             </w:r>
           </w:p>
         </w:tc>
         <w:tc>
           <w:tcPr>
-            <w:tcW w:w="3343" w:type="dxa"/>
+            <w:tcW w:type="dxa" w:w="6406"/>
+            <w:vAlign w:val="center"/>
             <w:tcMar>
-              <w:top w:w="70" w:type="dxa"/>
-              <w:left w:w="80" w:type="dxa"/>
-              <w:bottom w:w="70" w:type="dxa"/>
-              <w:right w:w="80" w:type="dxa"/>
+              <w:top w:w="90" w:type="dxa"/>
+              <w:start w:w="110" w:type="dxa"/>
+              <w:bottom w:w="90" w:type="dxa"/>
+              <w:end w:w="110" w:type="dxa"/>
             </w:tcMar>
-            <w:vAlign w:val="center"/>
           </w:tcPr>
           <w:p>
             <w:pPr>
-              <w:spacing w:after="0" w:line="240" w:lineRule="auto"/>
-              <w:rPr>
-                <w:rFonts w:cs="Times New Roman"/>
-              </w:rPr>
+              <w:spacing w:before="0" w:after="0" w:line="252" w:lineRule="auto"/>
+              <w:jc w:val="left"/>
             </w:pPr>
+            <w:r/>
             <w:r>
               <w:rPr>
-                <w:rFonts w:cs="Times New Roman"/>
-                <w:sz w:val="21"/>
-              </w:rPr>
-              <w:t>Kho mã nguồn, kiểm tra tự động, môi trường phát triển, kiểm thử và chạy thật; cấu hình sao lưu ở mức ứng dụng.</w:t>
+                <w:rFonts w:ascii="Times New Roman" w:hAnsi="Times New Roman" w:eastAsia="Times New Roman"/>
+                <w:b w:val="0"/>
+                <w:sz w:val="18"/>
+              </w:rPr>
+              <w:t>Phiên bản Web responsive dùng trên máy tính và thiết bị di động; kho mã nguồn, cấu hình môi trường phát triển, kiểm thử và chạy thật; quy trình triển khai, kiểm tra tự động và hướng lỗi; hướng dẫn sao lưu. Chi phí máy chủ, tên miền, lưu trữ và dịch vụ bên thứ ba không thuộc Hợp đồng.</w:t>
             </w:r>
           </w:p>
         </w:tc>
@@ -2741,30 +2759,29 @@
       <w:tr>
         <w:trPr>
           <w:cantSplit/>
-          <w:jc w:val="center"/>
         </w:trPr>
         <w:tc>
           <w:tcPr>
-            <w:tcW w:w="3343" w:type="dxa"/>
+            <w:tcW w:type="dxa" w:w="624"/>
+            <w:vAlign w:val="center"/>
             <w:tcMar>
-              <w:top w:w="70" w:type="dxa"/>
-              <w:left w:w="80" w:type="dxa"/>
-              <w:bottom w:w="70" w:type="dxa"/>
-              <w:right w:w="80" w:type="dxa"/>
+              <w:top w:w="90" w:type="dxa"/>
+              <w:start w:w="110" w:type="dxa"/>
+              <w:bottom w:w="90" w:type="dxa"/>
+              <w:end w:w="110" w:type="dxa"/>
             </w:tcMar>
-            <w:vAlign w:val="center"/>
           </w:tcPr>
           <w:p>
             <w:pPr>
-              <w:spacing w:after="0" w:line="240" w:lineRule="auto"/>
-              <w:rPr>
-                <w:rFonts w:cs="Times New Roman"/>
-              </w:rPr>
+              <w:spacing w:before="0" w:after="0" w:line="252" w:lineRule="auto"/>
+              <w:jc w:val="center"/>
             </w:pPr>
+            <w:r/>
             <w:r>
               <w:rPr>
-                <w:rFonts w:cs="Times New Roman"/>
-                <w:sz w:val="21"/>
+                <w:rFonts w:ascii="Times New Roman" w:hAnsi="Times New Roman" w:eastAsia="Times New Roman"/>
+                <w:b w:val="0"/>
+                <w:sz w:val="18"/>
               </w:rPr>
               <w:t>2</w:t>
             </w:r>
@@ -2772,55 +2789,55 @@
         </w:tc>
         <w:tc>
           <w:tcPr>
-            <w:tcW w:w="3343" w:type="dxa"/>
+            <w:tcW w:type="dxa" w:w="2494"/>
+            <w:vAlign w:val="center"/>
             <w:tcMar>
-              <w:top w:w="70" w:type="dxa"/>
-              <w:left w:w="80" w:type="dxa"/>
-              <w:bottom w:w="70" w:type="dxa"/>
-              <w:right w:w="80" w:type="dxa"/>
+              <w:top w:w="90" w:type="dxa"/>
+              <w:start w:w="110" w:type="dxa"/>
+              <w:bottom w:w="90" w:type="dxa"/>
+              <w:end w:w="110" w:type="dxa"/>
             </w:tcMar>
-            <w:vAlign w:val="center"/>
           </w:tcPr>
           <w:p>
             <w:pPr>
-              <w:spacing w:after="0" w:line="240" w:lineRule="auto"/>
-              <w:rPr>
-                <w:rFonts w:cs="Times New Roman"/>
-              </w:rPr>
+              <w:spacing w:before="0" w:after="0" w:line="252" w:lineRule="auto"/>
+              <w:jc w:val="left"/>
             </w:pPr>
+            <w:r/>
             <w:r>
               <w:rPr>
-                <w:rFonts w:cs="Times New Roman"/>
-                <w:sz w:val="21"/>
-              </w:rPr>
-              <w:t>Thiết kế giao diện</w:t>
+                <w:rFonts w:ascii="Times New Roman" w:hAnsi="Times New Roman" w:eastAsia="Times New Roman"/>
+                <w:b/>
+                <w:sz w:val="18"/>
+              </w:rPr>
+              <w:t>Giao diện và điều hướng chung</w:t>
             </w:r>
           </w:p>
         </w:tc>
         <w:tc>
           <w:tcPr>
-            <w:tcW w:w="3343" w:type="dxa"/>
+            <w:tcW w:type="dxa" w:w="6406"/>
+            <w:vAlign w:val="center"/>
             <w:tcMar>
-              <w:top w:w="70" w:type="dxa"/>
-              <w:left w:w="80" w:type="dxa"/>
-              <w:bottom w:w="70" w:type="dxa"/>
-              <w:right w:w="80" w:type="dxa"/>
+              <w:top w:w="90" w:type="dxa"/>
+              <w:start w:w="110" w:type="dxa"/>
+              <w:bottom w:w="90" w:type="dxa"/>
+              <w:end w:w="110" w:type="dxa"/>
             </w:tcMar>
-            <w:vAlign w:val="center"/>
           </w:tcPr>
           <w:p>
             <w:pPr>
-              <w:spacing w:after="0" w:line="240" w:lineRule="auto"/>
-              <w:rPr>
-                <w:rFonts w:cs="Times New Roman"/>
-              </w:rPr>
+              <w:spacing w:before="0" w:after="0" w:line="252" w:lineRule="auto"/>
+              <w:jc w:val="left"/>
             </w:pPr>
+            <w:r/>
             <w:r>
               <w:rPr>
-                <w:rFonts w:cs="Times New Roman"/>
-                <w:sz w:val="21"/>
-              </w:rPr>
-              <w:t>Trang đầu; trang dự án với 08 khu vực; catalog; mẫu soạn tin 02 cột; cây tài liệu và thành phần dùng chung, hiển thị thích ứng.</w:t>
+                <w:rFonts w:ascii="Times New Roman" w:hAnsi="Times New Roman" w:eastAsia="Times New Roman"/>
+                <w:b w:val="0"/>
+                <w:sz w:val="18"/>
+              </w:rPr>
+              <w:t>Khung giao diện thống nhất, menu theo quyền, các trạng thái tải dữ liệu, trống và báo lỗi; hiển thị thích ứng; điều hướng giữa Trang đầu, Dự án, Sản phẩm, Tài liệu, Bài đăng, Quản trị và Người dùng.</w:t>
             </w:r>
           </w:p>
         </w:tc>
@@ -2828,30 +2845,29 @@
       <w:tr>
         <w:trPr>
           <w:cantSplit/>
-          <w:jc w:val="center"/>
         </w:trPr>
         <w:tc>
           <w:tcPr>
-            <w:tcW w:w="3343" w:type="dxa"/>
+            <w:tcW w:type="dxa" w:w="624"/>
+            <w:vAlign w:val="center"/>
             <w:tcMar>
-              <w:top w:w="70" w:type="dxa"/>
-              <w:left w:w="80" w:type="dxa"/>
-              <w:bottom w:w="70" w:type="dxa"/>
-              <w:right w:w="80" w:type="dxa"/>
+              <w:top w:w="90" w:type="dxa"/>
+              <w:start w:w="110" w:type="dxa"/>
+              <w:bottom w:w="90" w:type="dxa"/>
+              <w:end w:w="110" w:type="dxa"/>
             </w:tcMar>
-            <w:vAlign w:val="center"/>
           </w:tcPr>
           <w:p>
             <w:pPr>
-              <w:spacing w:after="0" w:line="240" w:lineRule="auto"/>
-              <w:rPr>
-                <w:rFonts w:cs="Times New Roman"/>
-              </w:rPr>
+              <w:spacing w:before="0" w:after="0" w:line="252" w:lineRule="auto"/>
+              <w:jc w:val="center"/>
             </w:pPr>
+            <w:r/>
             <w:r>
               <w:rPr>
-                <w:rFonts w:cs="Times New Roman"/>
-                <w:sz w:val="21"/>
+                <w:rFonts w:ascii="Times New Roman" w:hAnsi="Times New Roman" w:eastAsia="Times New Roman"/>
+                <w:b w:val="0"/>
+                <w:sz w:val="18"/>
               </w:rPr>
               <w:t>3</w:t>
             </w:r>
@@ -2859,55 +2875,55 @@
         </w:tc>
         <w:tc>
           <w:tcPr>
-            <w:tcW w:w="3343" w:type="dxa"/>
+            <w:tcW w:type="dxa" w:w="2494"/>
+            <w:vAlign w:val="center"/>
             <w:tcMar>
-              <w:top w:w="70" w:type="dxa"/>
-              <w:left w:w="80" w:type="dxa"/>
-              <w:bottom w:w="70" w:type="dxa"/>
-              <w:right w:w="80" w:type="dxa"/>
+              <w:top w:w="90" w:type="dxa"/>
+              <w:start w:w="110" w:type="dxa"/>
+              <w:bottom w:w="90" w:type="dxa"/>
+              <w:end w:w="110" w:type="dxa"/>
             </w:tcMar>
-            <w:vAlign w:val="center"/>
           </w:tcPr>
           <w:p>
             <w:pPr>
-              <w:spacing w:after="0" w:line="240" w:lineRule="auto"/>
-              <w:rPr>
-                <w:rFonts w:cs="Times New Roman"/>
-              </w:rPr>
+              <w:spacing w:before="0" w:after="0" w:line="252" w:lineRule="auto"/>
+              <w:jc w:val="left"/>
             </w:pPr>
+            <w:r/>
             <w:r>
               <w:rPr>
-                <w:rFonts w:cs="Times New Roman"/>
-                <w:sz w:val="21"/>
-              </w:rPr>
-              <w:t>Mô hình dữ liệu</w:t>
+                <w:rFonts w:ascii="Times New Roman" w:hAnsi="Times New Roman" w:eastAsia="Times New Roman"/>
+                <w:b/>
+                <w:sz w:val="18"/>
+              </w:rPr>
+              <w:t>Trang đầu</w:t>
             </w:r>
           </w:p>
         </w:tc>
         <w:tc>
           <w:tcPr>
-            <w:tcW w:w="3343" w:type="dxa"/>
+            <w:tcW w:type="dxa" w:w="6406"/>
+            <w:vAlign w:val="center"/>
             <w:tcMar>
-              <w:top w:w="70" w:type="dxa"/>
-              <w:left w:w="80" w:type="dxa"/>
-              <w:bottom w:w="70" w:type="dxa"/>
-              <w:right w:w="80" w:type="dxa"/>
+              <w:top w:w="90" w:type="dxa"/>
+              <w:start w:w="110" w:type="dxa"/>
+              <w:bottom w:w="90" w:type="dxa"/>
+              <w:end w:w="110" w:type="dxa"/>
             </w:tcMar>
-            <w:vAlign w:val="center"/>
           </w:tcPr>
           <w:p>
             <w:pPr>
-              <w:spacing w:after="0" w:line="240" w:lineRule="auto"/>
-              <w:rPr>
-                <w:rFonts w:cs="Times New Roman"/>
-              </w:rPr>
+              <w:spacing w:before="0" w:after="0" w:line="252" w:lineRule="auto"/>
+              <w:jc w:val="left"/>
             </w:pPr>
+            <w:r/>
             <w:r>
               <w:rPr>
-                <w:rFonts w:cs="Times New Roman"/>
-                <w:sz w:val="21"/>
-              </w:rPr>
-              <w:t>Dự án; cây phân khu, tòa/dãy, tầng, căn/lô; mẫu nội dung; tài liệu và thẻ liên kết.</w:t>
+                <w:rFonts w:ascii="Times New Roman" w:hAnsi="Times New Roman" w:eastAsia="Times New Roman"/>
+                <w:b w:val="0"/>
+                <w:sz w:val="18"/>
+              </w:rPr>
+              <w:t>Hiển thị theo người dùng: dự án được giao, dự án nổi bật, dải Sản phẩm Hot, bài đăng dùng chung, việc chờ duyệt và cảnh báo tài liệu hoặc tài khoản cần xử lý. Nội dung không có quyền xem phải được ẩn.</w:t>
             </w:r>
           </w:p>
         </w:tc>
@@ -2915,30 +2931,29 @@
       <w:tr>
         <w:trPr>
           <w:cantSplit/>
-          <w:jc w:val="center"/>
         </w:trPr>
         <w:tc>
           <w:tcPr>
-            <w:tcW w:w="3343" w:type="dxa"/>
+            <w:tcW w:type="dxa" w:w="624"/>
+            <w:vAlign w:val="center"/>
             <w:tcMar>
-              <w:top w:w="70" w:type="dxa"/>
-              <w:left w:w="80" w:type="dxa"/>
-              <w:bottom w:w="70" w:type="dxa"/>
-              <w:right w:w="80" w:type="dxa"/>
+              <w:top w:w="90" w:type="dxa"/>
+              <w:start w:w="110" w:type="dxa"/>
+              <w:bottom w:w="90" w:type="dxa"/>
+              <w:end w:w="110" w:type="dxa"/>
             </w:tcMar>
-            <w:vAlign w:val="center"/>
           </w:tcPr>
           <w:p>
             <w:pPr>
-              <w:spacing w:after="0" w:line="240" w:lineRule="auto"/>
-              <w:rPr>
-                <w:rFonts w:cs="Times New Roman"/>
-              </w:rPr>
+              <w:spacing w:before="0" w:after="0" w:line="252" w:lineRule="auto"/>
+              <w:jc w:val="center"/>
             </w:pPr>
+            <w:r/>
             <w:r>
               <w:rPr>
-                <w:rFonts w:cs="Times New Roman"/>
-                <w:sz w:val="21"/>
+                <w:rFonts w:ascii="Times New Roman" w:hAnsi="Times New Roman" w:eastAsia="Times New Roman"/>
+                <w:b w:val="0"/>
+                <w:sz w:val="18"/>
               </w:rPr>
               <w:t>4</w:t>
             </w:r>
@@ -2946,55 +2961,55 @@
         </w:tc>
         <w:tc>
           <w:tcPr>
-            <w:tcW w:w="3343" w:type="dxa"/>
+            <w:tcW w:type="dxa" w:w="2494"/>
+            <w:vAlign w:val="center"/>
             <w:tcMar>
-              <w:top w:w="70" w:type="dxa"/>
-              <w:left w:w="80" w:type="dxa"/>
-              <w:bottom w:w="70" w:type="dxa"/>
-              <w:right w:w="80" w:type="dxa"/>
+              <w:top w:w="90" w:type="dxa"/>
+              <w:start w:w="110" w:type="dxa"/>
+              <w:bottom w:w="90" w:type="dxa"/>
+              <w:end w:w="110" w:type="dxa"/>
             </w:tcMar>
-            <w:vAlign w:val="center"/>
           </w:tcPr>
           <w:p>
             <w:pPr>
-              <w:spacing w:after="0" w:line="240" w:lineRule="auto"/>
-              <w:rPr>
-                <w:rFonts w:cs="Times New Roman"/>
-              </w:rPr>
+              <w:spacing w:before="0" w:after="0" w:line="252" w:lineRule="auto"/>
+              <w:jc w:val="left"/>
             </w:pPr>
+            <w:r/>
             <w:r>
               <w:rPr>
-                <w:rFonts w:cs="Times New Roman"/>
-                <w:sz w:val="21"/>
-              </w:rPr>
-              <w:t>Xác thực và phiên</w:t>
+                <w:rFonts w:ascii="Times New Roman" w:hAnsi="Times New Roman" w:eastAsia="Times New Roman"/>
+                <w:b/>
+                <w:sz w:val="18"/>
+              </w:rPr>
+              <w:t>Đăng nhập và phiên sử dụng</w:t>
             </w:r>
           </w:p>
         </w:tc>
         <w:tc>
           <w:tcPr>
-            <w:tcW w:w="3343" w:type="dxa"/>
+            <w:tcW w:type="dxa" w:w="6406"/>
+            <w:vAlign w:val="center"/>
             <w:tcMar>
-              <w:top w:w="70" w:type="dxa"/>
-              <w:left w:w="80" w:type="dxa"/>
-              <w:bottom w:w="70" w:type="dxa"/>
-              <w:right w:w="80" w:type="dxa"/>
+              <w:top w:w="90" w:type="dxa"/>
+              <w:start w:w="110" w:type="dxa"/>
+              <w:bottom w:w="90" w:type="dxa"/>
+              <w:end w:w="110" w:type="dxa"/>
             </w:tcMar>
-            <w:vAlign w:val="center"/>
           </w:tcPr>
           <w:p>
             <w:pPr>
-              <w:spacing w:after="0" w:line="240" w:lineRule="auto"/>
-              <w:rPr>
-                <w:rFonts w:cs="Times New Roman"/>
-              </w:rPr>
+              <w:spacing w:before="0" w:after="0" w:line="252" w:lineRule="auto"/>
+              <w:jc w:val="left"/>
             </w:pPr>
+            <w:r/>
             <w:r>
               <w:rPr>
-                <w:rFonts w:cs="Times New Roman"/>
-                <w:sz w:val="21"/>
-              </w:rPr>
-              <w:t>Đăng nhập bằng số điện thoại hoặc thư điện tử kèm mật khẩu; đăng xuất, đổi mật khẩu và quản lý phiên sử dụng.</w:t>
+                <w:rFonts w:ascii="Times New Roman" w:hAnsi="Times New Roman" w:eastAsia="Times New Roman"/>
+                <w:b w:val="0"/>
+                <w:sz w:val="18"/>
+              </w:rPr>
+              <w:t>Đăng nhập bằng số điện thoại hoặc thư điện tử và mật khẩu; đăng xuất, đặt lại mật khẩu và quản lý phiên sử dụng. Không bao gồm mã xác thực một lần (OTP) trong Giai đoạn 1.</w:t>
             </w:r>
           </w:p>
         </w:tc>
@@ -3002,30 +3017,29 @@
       <w:tr>
         <w:trPr>
           <w:cantSplit/>
-          <w:jc w:val="center"/>
         </w:trPr>
         <w:tc>
           <w:tcPr>
-            <w:tcW w:w="3343" w:type="dxa"/>
+            <w:tcW w:type="dxa" w:w="624"/>
+            <w:vAlign w:val="center"/>
             <w:tcMar>
-              <w:top w:w="70" w:type="dxa"/>
-              <w:left w:w="80" w:type="dxa"/>
-              <w:bottom w:w="70" w:type="dxa"/>
-              <w:right w:w="80" w:type="dxa"/>
+              <w:top w:w="90" w:type="dxa"/>
+              <w:start w:w="110" w:type="dxa"/>
+              <w:bottom w:w="90" w:type="dxa"/>
+              <w:end w:w="110" w:type="dxa"/>
             </w:tcMar>
-            <w:vAlign w:val="center"/>
           </w:tcPr>
           <w:p>
             <w:pPr>
-              <w:spacing w:after="0" w:line="240" w:lineRule="auto"/>
-              <w:rPr>
-                <w:rFonts w:cs="Times New Roman"/>
-              </w:rPr>
+              <w:spacing w:before="0" w:after="0" w:line="252" w:lineRule="auto"/>
+              <w:jc w:val="center"/>
             </w:pPr>
+            <w:r/>
             <w:r>
               <w:rPr>
-                <w:rFonts w:cs="Times New Roman"/>
-                <w:sz w:val="21"/>
+                <w:rFonts w:ascii="Times New Roman" w:hAnsi="Times New Roman" w:eastAsia="Times New Roman"/>
+                <w:b w:val="0"/>
+                <w:sz w:val="18"/>
               </w:rPr>
               <w:t>5</w:t>
             </w:r>
@@ -3033,55 +3047,55 @@
         </w:tc>
         <w:tc>
           <w:tcPr>
-            <w:tcW w:w="3343" w:type="dxa"/>
+            <w:tcW w:type="dxa" w:w="2494"/>
+            <w:vAlign w:val="center"/>
             <w:tcMar>
-              <w:top w:w="70" w:type="dxa"/>
-              <w:left w:w="80" w:type="dxa"/>
-              <w:bottom w:w="70" w:type="dxa"/>
-              <w:right w:w="80" w:type="dxa"/>
+              <w:top w:w="90" w:type="dxa"/>
+              <w:start w:w="110" w:type="dxa"/>
+              <w:bottom w:w="90" w:type="dxa"/>
+              <w:end w:w="110" w:type="dxa"/>
             </w:tcMar>
-            <w:vAlign w:val="center"/>
           </w:tcPr>
           <w:p>
             <w:pPr>
-              <w:spacing w:after="0" w:line="240" w:lineRule="auto"/>
-              <w:rPr>
-                <w:rFonts w:cs="Times New Roman"/>
-              </w:rPr>
+              <w:spacing w:before="0" w:after="0" w:line="252" w:lineRule="auto"/>
+              <w:jc w:val="left"/>
             </w:pPr>
+            <w:r/>
             <w:r>
               <w:rPr>
-                <w:rFonts w:cs="Times New Roman"/>
-                <w:sz w:val="21"/>
-              </w:rPr>
-              <w:t>Phân quyền</w:t>
+                <w:rFonts w:ascii="Times New Roman" w:hAnsi="Times New Roman" w:eastAsia="Times New Roman"/>
+                <w:b/>
+                <w:sz w:val="18"/>
+              </w:rPr>
+              <w:t>Người dùng và phân quyền</w:t>
             </w:r>
           </w:p>
         </w:tc>
         <w:tc>
           <w:tcPr>
-            <w:tcW w:w="3343" w:type="dxa"/>
+            <w:tcW w:type="dxa" w:w="6406"/>
+            <w:vAlign w:val="center"/>
             <w:tcMar>
-              <w:top w:w="70" w:type="dxa"/>
-              <w:left w:w="80" w:type="dxa"/>
-              <w:bottom w:w="70" w:type="dxa"/>
-              <w:right w:w="80" w:type="dxa"/>
+              <w:top w:w="90" w:type="dxa"/>
+              <w:start w:w="110" w:type="dxa"/>
+              <w:bottom w:w="90" w:type="dxa"/>
+              <w:end w:w="110" w:type="dxa"/>
             </w:tcMar>
-            <w:vAlign w:val="center"/>
           </w:tcPr>
           <w:p>
             <w:pPr>
-              <w:spacing w:after="0" w:line="240" w:lineRule="auto"/>
-              <w:rPr>
-                <w:rFonts w:cs="Times New Roman"/>
-              </w:rPr>
+              <w:spacing w:before="0" w:after="0" w:line="252" w:lineRule="auto"/>
+              <w:jc w:val="left"/>
             </w:pPr>
+            <w:r/>
             <w:r>
               <w:rPr>
-                <w:rFonts w:cs="Times New Roman"/>
-                <w:sz w:val="21"/>
-              </w:rPr>
-              <w:t>Vai trò người dùng; nhãn nội dung; phạm vi dự án được giao; kiểm soát quyền xem, tạo, sửa và duyệt.</w:t>
+                <w:rFonts w:ascii="Times New Roman" w:hAnsi="Times New Roman" w:eastAsia="Times New Roman"/>
+                <w:b w:val="0"/>
+                <w:sz w:val="18"/>
+              </w:rPr>
+              <w:t>Quản lý tài khoản, trạng thái sử dụng, vai trò và phạm vi dự án được giao; phân quyền xem, tạo, sửa, duyệt và chia sẻ. Nội dung có ba mức Công khai, Nội bộ và Nội bộ hạn chế; quyền của mục cha được kế thừa xuống mục con theo mức chặt hơn.</w:t>
             </w:r>
           </w:p>
         </w:tc>
@@ -3089,30 +3103,29 @@
       <w:tr>
         <w:trPr>
           <w:cantSplit/>
-          <w:jc w:val="center"/>
         </w:trPr>
         <w:tc>
           <w:tcPr>
-            <w:tcW w:w="3343" w:type="dxa"/>
+            <w:tcW w:type="dxa" w:w="624"/>
+            <w:vAlign w:val="center"/>
             <w:tcMar>
-              <w:top w:w="70" w:type="dxa"/>
-              <w:left w:w="80" w:type="dxa"/>
-              <w:bottom w:w="70" w:type="dxa"/>
-              <w:right w:w="80" w:type="dxa"/>
+              <w:top w:w="90" w:type="dxa"/>
+              <w:start w:w="110" w:type="dxa"/>
+              <w:bottom w:w="90" w:type="dxa"/>
+              <w:end w:w="110" w:type="dxa"/>
             </w:tcMar>
-            <w:vAlign w:val="center"/>
           </w:tcPr>
           <w:p>
             <w:pPr>
-              <w:spacing w:after="0" w:line="240" w:lineRule="auto"/>
-              <w:rPr>
-                <w:rFonts w:cs="Times New Roman"/>
-              </w:rPr>
+              <w:spacing w:before="0" w:after="0" w:line="252" w:lineRule="auto"/>
+              <w:jc w:val="center"/>
             </w:pPr>
+            <w:r/>
             <w:r>
               <w:rPr>
-                <w:rFonts w:cs="Times New Roman"/>
-                <w:sz w:val="21"/>
+                <w:rFonts w:ascii="Times New Roman" w:hAnsi="Times New Roman" w:eastAsia="Times New Roman"/>
+                <w:b w:val="0"/>
+                <w:sz w:val="18"/>
               </w:rPr>
               <w:t>6</w:t>
             </w:r>
@@ -3120,55 +3133,55 @@
         </w:tc>
         <w:tc>
           <w:tcPr>
-            <w:tcW w:w="3343" w:type="dxa"/>
+            <w:tcW w:type="dxa" w:w="2494"/>
+            <w:vAlign w:val="center"/>
             <w:tcMar>
-              <w:top w:w="70" w:type="dxa"/>
-              <w:left w:w="80" w:type="dxa"/>
-              <w:bottom w:w="70" w:type="dxa"/>
-              <w:right w:w="80" w:type="dxa"/>
+              <w:top w:w="90" w:type="dxa"/>
+              <w:start w:w="110" w:type="dxa"/>
+              <w:bottom w:w="90" w:type="dxa"/>
+              <w:end w:w="110" w:type="dxa"/>
             </w:tcMar>
-            <w:vAlign w:val="center"/>
           </w:tcPr>
           <w:p>
             <w:pPr>
-              <w:spacing w:after="0" w:line="240" w:lineRule="auto"/>
-              <w:rPr>
-                <w:rFonts w:cs="Times New Roman"/>
-              </w:rPr>
+              <w:spacing w:before="0" w:after="0" w:line="252" w:lineRule="auto"/>
+              <w:jc w:val="left"/>
             </w:pPr>
+            <w:r/>
             <w:r>
               <w:rPr>
-                <w:rFonts w:cs="Times New Roman"/>
-                <w:sz w:val="21"/>
-              </w:rPr>
-              <w:t>Quản trị dự án và tài liệu</w:t>
+                <w:rFonts w:ascii="Times New Roman" w:hAnsi="Times New Roman" w:eastAsia="Times New Roman"/>
+                <w:b/>
+                <w:sz w:val="18"/>
+              </w:rPr>
+              <w:t>Dự án</w:t>
             </w:r>
           </w:p>
         </w:tc>
         <w:tc>
           <w:tcPr>
-            <w:tcW w:w="3343" w:type="dxa"/>
+            <w:tcW w:type="dxa" w:w="6406"/>
+            <w:vAlign w:val="center"/>
             <w:tcMar>
-              <w:top w:w="70" w:type="dxa"/>
-              <w:left w:w="80" w:type="dxa"/>
-              <w:bottom w:w="70" w:type="dxa"/>
-              <w:right w:w="80" w:type="dxa"/>
+              <w:top w:w="90" w:type="dxa"/>
+              <w:start w:w="110" w:type="dxa"/>
+              <w:bottom w:w="90" w:type="dxa"/>
+              <w:end w:w="110" w:type="dxa"/>
             </w:tcMar>
-            <w:vAlign w:val="center"/>
           </w:tcPr>
           <w:p>
             <w:pPr>
-              <w:spacing w:after="0" w:line="240" w:lineRule="auto"/>
-              <w:rPr>
-                <w:rFonts w:cs="Times New Roman"/>
-              </w:rPr>
+              <w:spacing w:before="0" w:after="0" w:line="252" w:lineRule="auto"/>
+              <w:jc w:val="left"/>
             </w:pPr>
+            <w:r/>
             <w:r>
               <w:rPr>
-                <w:rFonts w:cs="Times New Roman"/>
-                <w:sz w:val="21"/>
-              </w:rPr>
-              <w:t>Hồ sơ dự án theo 08 khu vực; Drive ngoài chỉ lưu thẻ URL; cây 07 nhánh để duyệt và tra cứu nguồn.</w:t>
+                <w:rFonts w:ascii="Times New Roman" w:hAnsi="Times New Roman" w:eastAsia="Times New Roman"/>
+                <w:b w:val="0"/>
+                <w:sz w:val="18"/>
+              </w:rPr>
+              <w:t>Danh sách, tìm kiếm và lọc dự án theo trạng thái kinh doanh, khu vực, loại hình, phân khúc, khoảng giá và diện tích; tạo, cập nhật, ẩn và đánh dấu dự án nổi bật theo quyền. Người dùng chỉ thấy dự án được phép truy cập.</w:t>
             </w:r>
           </w:p>
         </w:tc>
@@ -3176,30 +3189,29 @@
       <w:tr>
         <w:trPr>
           <w:cantSplit/>
-          <w:jc w:val="center"/>
         </w:trPr>
         <w:tc>
           <w:tcPr>
-            <w:tcW w:w="3343" w:type="dxa"/>
+            <w:tcW w:type="dxa" w:w="624"/>
+            <w:vAlign w:val="center"/>
             <w:tcMar>
-              <w:top w:w="70" w:type="dxa"/>
-              <w:left w:w="80" w:type="dxa"/>
-              <w:bottom w:w="70" w:type="dxa"/>
-              <w:right w:w="80" w:type="dxa"/>
+              <w:top w:w="90" w:type="dxa"/>
+              <w:start w:w="110" w:type="dxa"/>
+              <w:bottom w:w="90" w:type="dxa"/>
+              <w:end w:w="110" w:type="dxa"/>
             </w:tcMar>
-            <w:vAlign w:val="center"/>
           </w:tcPr>
           <w:p>
             <w:pPr>
-              <w:spacing w:after="0" w:line="240" w:lineRule="auto"/>
-              <w:rPr>
-                <w:rFonts w:cs="Times New Roman"/>
-              </w:rPr>
+              <w:spacing w:before="0" w:after="0" w:line="252" w:lineRule="auto"/>
+              <w:jc w:val="center"/>
             </w:pPr>
+            <w:r/>
             <w:r>
               <w:rPr>
-                <w:rFonts w:cs="Times New Roman"/>
-                <w:sz w:val="21"/>
+                <w:rFonts w:ascii="Times New Roman" w:hAnsi="Times New Roman" w:eastAsia="Times New Roman"/>
+                <w:b w:val="0"/>
+                <w:sz w:val="18"/>
               </w:rPr>
               <w:t>7</w:t>
             </w:r>
@@ -3207,55 +3219,55 @@
         </w:tc>
         <w:tc>
           <w:tcPr>
-            <w:tcW w:w="3343" w:type="dxa"/>
+            <w:tcW w:type="dxa" w:w="2494"/>
+            <w:vAlign w:val="center"/>
             <w:tcMar>
-              <w:top w:w="70" w:type="dxa"/>
-              <w:left w:w="80" w:type="dxa"/>
-              <w:bottom w:w="70" w:type="dxa"/>
-              <w:right w:w="80" w:type="dxa"/>
+              <w:top w:w="90" w:type="dxa"/>
+              <w:start w:w="110" w:type="dxa"/>
+              <w:bottom w:w="90" w:type="dxa"/>
+              <w:end w:w="110" w:type="dxa"/>
             </w:tcMar>
-            <w:vAlign w:val="center"/>
           </w:tcPr>
           <w:p>
             <w:pPr>
-              <w:spacing w:after="0" w:line="240" w:lineRule="auto"/>
-              <w:rPr>
-                <w:rFonts w:cs="Times New Roman"/>
-              </w:rPr>
+              <w:spacing w:before="0" w:after="0" w:line="252" w:lineRule="auto"/>
+              <w:jc w:val="left"/>
             </w:pPr>
+            <w:r/>
             <w:r>
               <w:rPr>
-                <w:rFonts w:cs="Times New Roman"/>
-                <w:sz w:val="21"/>
-              </w:rPr>
-              <w:t>Cây sản phẩm và catalog</w:t>
+                <w:rFonts w:ascii="Times New Roman" w:hAnsi="Times New Roman" w:eastAsia="Times New Roman"/>
+                <w:b/>
+                <w:sz w:val="18"/>
+              </w:rPr>
+              <w:t>Hồ sơ và nội dung dự án</w:t>
             </w:r>
           </w:p>
         </w:tc>
         <w:tc>
           <w:tcPr>
-            <w:tcW w:w="3343" w:type="dxa"/>
+            <w:tcW w:type="dxa" w:w="6406"/>
+            <w:vAlign w:val="center"/>
             <w:tcMar>
-              <w:top w:w="70" w:type="dxa"/>
-              <w:left w:w="80" w:type="dxa"/>
-              <w:bottom w:w="70" w:type="dxa"/>
-              <w:right w:w="80" w:type="dxa"/>
+              <w:top w:w="90" w:type="dxa"/>
+              <w:start w:w="110" w:type="dxa"/>
+              <w:bottom w:w="90" w:type="dxa"/>
+              <w:end w:w="110" w:type="dxa"/>
             </w:tcMar>
-            <w:vAlign w:val="center"/>
           </w:tcPr>
           <w:p>
             <w:pPr>
-              <w:spacing w:after="0" w:line="240" w:lineRule="auto"/>
-              <w:rPr>
-                <w:rFonts w:cs="Times New Roman"/>
-              </w:rPr>
+              <w:spacing w:before="0" w:after="0" w:line="252" w:lineRule="auto"/>
+              <w:jc w:val="left"/>
             </w:pPr>
+            <w:r/>
             <w:r>
               <w:rPr>
-                <w:rFonts w:cs="Times New Roman"/>
-                <w:sz w:val="21"/>
-              </w:rPr>
-              <w:t>Quản lý phân khu, tòa/dãy, tầng, căn/lô; catalog có tìm kiếm, lọc và chi tiết căn/lô không hiển thị giá.</w:t>
+                <w:rFonts w:ascii="Times New Roman" w:hAnsi="Times New Roman" w:eastAsia="Times New Roman"/>
+                <w:b w:val="0"/>
+                <w:sz w:val="18"/>
+              </w:rPr>
+              <w:t>Trang chi tiết dự án gồm các khối trong bản mô phỏng Giai đoạn 1: tổng quan, vị trí và liên kết vùng, tiện ích và điểm chính, mặt bằng, Sản phẩm Hot, Bài đăng, tài liệu nguồn, ảnh và tài liệu bán hàng. Cho phép người có quyền cập nhật từng khối và gắn nhãn công khai hoặc nội bộ.</w:t>
             </w:r>
           </w:p>
         </w:tc>
@@ -3263,30 +3275,29 @@
       <w:tr>
         <w:trPr>
           <w:cantSplit/>
-          <w:jc w:val="center"/>
         </w:trPr>
         <w:tc>
           <w:tcPr>
-            <w:tcW w:w="3343" w:type="dxa"/>
+            <w:tcW w:type="dxa" w:w="624"/>
+            <w:vAlign w:val="center"/>
             <w:tcMar>
-              <w:top w:w="70" w:type="dxa"/>
-              <w:left w:w="80" w:type="dxa"/>
-              <w:bottom w:w="70" w:type="dxa"/>
-              <w:right w:w="80" w:type="dxa"/>
+              <w:top w:w="90" w:type="dxa"/>
+              <w:start w:w="110" w:type="dxa"/>
+              <w:bottom w:w="90" w:type="dxa"/>
+              <w:end w:w="110" w:type="dxa"/>
             </w:tcMar>
-            <w:vAlign w:val="center"/>
           </w:tcPr>
           <w:p>
             <w:pPr>
-              <w:spacing w:after="0" w:line="240" w:lineRule="auto"/>
-              <w:rPr>
-                <w:rFonts w:cs="Times New Roman"/>
-              </w:rPr>
+              <w:spacing w:before="0" w:after="0" w:line="252" w:lineRule="auto"/>
+              <w:jc w:val="center"/>
             </w:pPr>
+            <w:r/>
             <w:r>
               <w:rPr>
-                <w:rFonts w:cs="Times New Roman"/>
-                <w:sz w:val="21"/>
+                <w:rFonts w:ascii="Times New Roman" w:hAnsi="Times New Roman" w:eastAsia="Times New Roman"/>
+                <w:b w:val="0"/>
+                <w:sz w:val="18"/>
               </w:rPr>
               <w:t>8</w:t>
             </w:r>
@@ -3294,55 +3305,55 @@
         </w:tc>
         <w:tc>
           <w:tcPr>
-            <w:tcW w:w="3343" w:type="dxa"/>
+            <w:tcW w:type="dxa" w:w="2494"/>
+            <w:vAlign w:val="center"/>
             <w:tcMar>
-              <w:top w:w="70" w:type="dxa"/>
-              <w:left w:w="80" w:type="dxa"/>
-              <w:bottom w:w="70" w:type="dxa"/>
-              <w:right w:w="80" w:type="dxa"/>
+              <w:top w:w="90" w:type="dxa"/>
+              <w:start w:w="110" w:type="dxa"/>
+              <w:bottom w:w="90" w:type="dxa"/>
+              <w:end w:w="110" w:type="dxa"/>
             </w:tcMar>
-            <w:vAlign w:val="center"/>
           </w:tcPr>
           <w:p>
             <w:pPr>
-              <w:spacing w:after="0" w:line="240" w:lineRule="auto"/>
-              <w:rPr>
-                <w:rFonts w:cs="Times New Roman"/>
-              </w:rPr>
+              <w:spacing w:before="0" w:after="0" w:line="252" w:lineRule="auto"/>
+              <w:jc w:val="left"/>
             </w:pPr>
+            <w:r/>
             <w:r>
               <w:rPr>
-                <w:rFonts w:cs="Times New Roman"/>
-                <w:sz w:val="21"/>
-              </w:rPr>
-              <w:t>Sản phẩm nổi bật</w:t>
+                <w:rFonts w:ascii="Times New Roman" w:hAnsi="Times New Roman" w:eastAsia="Times New Roman"/>
+                <w:b/>
+                <w:sz w:val="18"/>
+              </w:rPr>
+              <w:t>Sản phẩm và catalog</w:t>
             </w:r>
           </w:p>
         </w:tc>
         <w:tc>
           <w:tcPr>
-            <w:tcW w:w="3343" w:type="dxa"/>
+            <w:tcW w:type="dxa" w:w="6406"/>
+            <w:vAlign w:val="center"/>
             <w:tcMar>
-              <w:top w:w="70" w:type="dxa"/>
-              <w:left w:w="80" w:type="dxa"/>
-              <w:bottom w:w="70" w:type="dxa"/>
-              <w:right w:w="80" w:type="dxa"/>
+              <w:top w:w="90" w:type="dxa"/>
+              <w:start w:w="110" w:type="dxa"/>
+              <w:bottom w:w="90" w:type="dxa"/>
+              <w:end w:w="110" w:type="dxa"/>
             </w:tcMar>
-            <w:vAlign w:val="center"/>
           </w:tcPr>
           <w:p>
             <w:pPr>
-              <w:spacing w:after="0" w:line="240" w:lineRule="auto"/>
-              <w:rPr>
-                <w:rFonts w:cs="Times New Roman"/>
-              </w:rPr>
+              <w:spacing w:before="0" w:after="0" w:line="252" w:lineRule="auto"/>
+              <w:jc w:val="left"/>
             </w:pPr>
+            <w:r/>
             <w:r>
               <w:rPr>
-                <w:rFonts w:cs="Times New Roman"/>
-                <w:sz w:val="21"/>
-              </w:rPr>
-              <w:t>Slider SP Hot tại Trang đầu và trang dự án; thẻ nội dung bán hàng, không có trường giá.</w:t>
+                <w:rFonts w:ascii="Times New Roman" w:hAnsi="Times New Roman" w:eastAsia="Times New Roman"/>
+                <w:b w:val="0"/>
+                <w:sz w:val="18"/>
+              </w:rPr>
+              <w:t>Quản lý cây phân khu, khối hoặc tòa, tầng và căn hoặc lô; thêm và cập nhật sản phẩm, diện tích, loại hình, số phòng ngủ và tình trạng. Catalog cho phép tìm theo mã và lọc theo dự án, loại hình, số phòng ngủ, tình trạng; có trang chi tiết và so sánh cơ bản. Không hiển thị hoặc tính giá.</w:t>
             </w:r>
           </w:p>
         </w:tc>
@@ -3350,30 +3361,29 @@
       <w:tr>
         <w:trPr>
           <w:cantSplit/>
-          <w:jc w:val="center"/>
         </w:trPr>
         <w:tc>
           <w:tcPr>
-            <w:tcW w:w="3343" w:type="dxa"/>
+            <w:tcW w:type="dxa" w:w="624"/>
+            <w:vAlign w:val="center"/>
             <w:tcMar>
-              <w:top w:w="70" w:type="dxa"/>
-              <w:left w:w="80" w:type="dxa"/>
-              <w:bottom w:w="70" w:type="dxa"/>
-              <w:right w:w="80" w:type="dxa"/>
+              <w:top w:w="90" w:type="dxa"/>
+              <w:start w:w="110" w:type="dxa"/>
+              <w:bottom w:w="90" w:type="dxa"/>
+              <w:end w:w="110" w:type="dxa"/>
             </w:tcMar>
-            <w:vAlign w:val="center"/>
           </w:tcPr>
           <w:p>
             <w:pPr>
-              <w:spacing w:after="0" w:line="240" w:lineRule="auto"/>
-              <w:rPr>
-                <w:rFonts w:cs="Times New Roman"/>
-              </w:rPr>
+              <w:spacing w:before="0" w:after="0" w:line="252" w:lineRule="auto"/>
+              <w:jc w:val="center"/>
             </w:pPr>
+            <w:r/>
             <w:r>
               <w:rPr>
-                <w:rFonts w:cs="Times New Roman"/>
-                <w:sz w:val="21"/>
+                <w:rFonts w:ascii="Times New Roman" w:hAnsi="Times New Roman" w:eastAsia="Times New Roman"/>
+                <w:b w:val="0"/>
+                <w:sz w:val="18"/>
               </w:rPr>
               <w:t>9</w:t>
             </w:r>
@@ -3381,55 +3391,55 @@
         </w:tc>
         <w:tc>
           <w:tcPr>
-            <w:tcW w:w="3343" w:type="dxa"/>
+            <w:tcW w:type="dxa" w:w="2494"/>
+            <w:vAlign w:val="center"/>
             <w:tcMar>
-              <w:top w:w="70" w:type="dxa"/>
-              <w:left w:w="80" w:type="dxa"/>
-              <w:bottom w:w="70" w:type="dxa"/>
-              <w:right w:w="80" w:type="dxa"/>
+              <w:top w:w="90" w:type="dxa"/>
+              <w:start w:w="110" w:type="dxa"/>
+              <w:bottom w:w="90" w:type="dxa"/>
+              <w:end w:w="110" w:type="dxa"/>
             </w:tcMar>
-            <w:vAlign w:val="center"/>
           </w:tcPr>
           <w:p>
             <w:pPr>
-              <w:spacing w:after="0" w:line="240" w:lineRule="auto"/>
-              <w:rPr>
-                <w:rFonts w:cs="Times New Roman"/>
-              </w:rPr>
+              <w:spacing w:before="0" w:after="0" w:line="252" w:lineRule="auto"/>
+              <w:jc w:val="left"/>
             </w:pPr>
+            <w:r/>
             <w:r>
               <w:rPr>
-                <w:rFonts w:cs="Times New Roman"/>
-                <w:sz w:val="21"/>
-              </w:rPr>
-              <w:t>Thư viện mẫu</w:t>
+                <w:rFonts w:ascii="Times New Roman" w:hAnsi="Times New Roman" w:eastAsia="Times New Roman"/>
+                <w:b/>
+                <w:sz w:val="18"/>
+              </w:rPr>
+              <w:t>Sản phẩm Hot</w:t>
             </w:r>
           </w:p>
         </w:tc>
         <w:tc>
           <w:tcPr>
-            <w:tcW w:w="3343" w:type="dxa"/>
+            <w:tcW w:type="dxa" w:w="6406"/>
+            <w:vAlign w:val="center"/>
             <w:tcMar>
-              <w:top w:w="70" w:type="dxa"/>
-              <w:left w:w="80" w:type="dxa"/>
-              <w:bottom w:w="70" w:type="dxa"/>
-              <w:right w:w="80" w:type="dxa"/>
+              <w:top w:w="90" w:type="dxa"/>
+              <w:start w:w="110" w:type="dxa"/>
+              <w:bottom w:w="90" w:type="dxa"/>
+              <w:end w:w="110" w:type="dxa"/>
             </w:tcMar>
-            <w:vAlign w:val="center"/>
           </w:tcPr>
           <w:p>
             <w:pPr>
-              <w:spacing w:after="0" w:line="240" w:lineRule="auto"/>
-              <w:rPr>
-                <w:rFonts w:cs="Times New Roman"/>
-              </w:rPr>
+              <w:spacing w:before="0" w:after="0" w:line="252" w:lineRule="auto"/>
+              <w:jc w:val="left"/>
             </w:pPr>
+            <w:r/>
             <w:r>
               <w:rPr>
-                <w:rFonts w:cs="Times New Roman"/>
-                <w:sz w:val="21"/>
-              </w:rPr>
-              <w:t>Kho mẫu dùng chung phải duyệt và kho cá nhân; lọc theo dự án/căn; tìm kiếm theo tiêu đề.</w:t>
+                <w:rFonts w:ascii="Times New Roman" w:hAnsi="Times New Roman" w:eastAsia="Times New Roman"/>
+                <w:b w:val="0"/>
+                <w:sz w:val="18"/>
+              </w:rPr>
+              <w:t>Người quản lý có quyền đánh dấu hoặc gỡ Sản phẩm Hot và nhập đoạn giới thiệu ngắn; hiển thị dạng danh sách trượt tại Trang đầu và trang dự án. Nhân viên bán hàng chỉ khai thác nội dung đã được duyệt, không tự gắn Hot.</w:t>
             </w:r>
           </w:p>
         </w:tc>
@@ -3437,30 +3447,29 @@
       <w:tr>
         <w:trPr>
           <w:cantSplit/>
-          <w:jc w:val="center"/>
         </w:trPr>
         <w:tc>
           <w:tcPr>
-            <w:tcW w:w="3343" w:type="dxa"/>
+            <w:tcW w:type="dxa" w:w="624"/>
+            <w:vAlign w:val="center"/>
             <w:tcMar>
-              <w:top w:w="70" w:type="dxa"/>
-              <w:left w:w="80" w:type="dxa"/>
-              <w:bottom w:w="70" w:type="dxa"/>
-              <w:right w:w="80" w:type="dxa"/>
+              <w:top w:w="90" w:type="dxa"/>
+              <w:start w:w="110" w:type="dxa"/>
+              <w:bottom w:w="90" w:type="dxa"/>
+              <w:end w:w="110" w:type="dxa"/>
             </w:tcMar>
-            <w:vAlign w:val="center"/>
           </w:tcPr>
           <w:p>
             <w:pPr>
-              <w:spacing w:after="0" w:line="240" w:lineRule="auto"/>
-              <w:rPr>
-                <w:rFonts w:cs="Times New Roman"/>
-              </w:rPr>
+              <w:spacing w:before="0" w:after="0" w:line="252" w:lineRule="auto"/>
+              <w:jc w:val="center"/>
             </w:pPr>
+            <w:r/>
             <w:r>
               <w:rPr>
-                <w:rFonts w:cs="Times New Roman"/>
-                <w:sz w:val="21"/>
+                <w:rFonts w:ascii="Times New Roman" w:hAnsi="Times New Roman" w:eastAsia="Times New Roman"/>
+                <w:b w:val="0"/>
+                <w:sz w:val="18"/>
               </w:rPr>
               <w:t>10</w:t>
             </w:r>
@@ -3468,55 +3477,55 @@
         </w:tc>
         <w:tc>
           <w:tcPr>
-            <w:tcW w:w="3343" w:type="dxa"/>
+            <w:tcW w:type="dxa" w:w="2494"/>
+            <w:vAlign w:val="center"/>
             <w:tcMar>
-              <w:top w:w="70" w:type="dxa"/>
-              <w:left w:w="80" w:type="dxa"/>
-              <w:bottom w:w="70" w:type="dxa"/>
-              <w:right w:w="80" w:type="dxa"/>
+              <w:top w:w="90" w:type="dxa"/>
+              <w:start w:w="110" w:type="dxa"/>
+              <w:bottom w:w="90" w:type="dxa"/>
+              <w:end w:w="110" w:type="dxa"/>
             </w:tcMar>
-            <w:vAlign w:val="center"/>
           </w:tcPr>
           <w:p>
             <w:pPr>
-              <w:spacing w:after="0" w:line="240" w:lineRule="auto"/>
-              <w:rPr>
-                <w:rFonts w:cs="Times New Roman"/>
-              </w:rPr>
+              <w:spacing w:before="0" w:after="0" w:line="252" w:lineRule="auto"/>
+              <w:jc w:val="left"/>
             </w:pPr>
+            <w:r/>
             <w:r>
               <w:rPr>
-                <w:rFonts w:cs="Times New Roman"/>
-                <w:sz w:val="21"/>
-              </w:rPr>
-              <w:t>Soạn và chia sẻ tin</w:t>
+                <w:rFonts w:ascii="Times New Roman" w:hAnsi="Times New Roman" w:eastAsia="Times New Roman"/>
+                <w:b/>
+                <w:sz w:val="18"/>
+              </w:rPr>
+              <w:t>Tài liệu</w:t>
             </w:r>
           </w:p>
         </w:tc>
         <w:tc>
           <w:tcPr>
-            <w:tcW w:w="3343" w:type="dxa"/>
+            <w:tcW w:type="dxa" w:w="6406"/>
+            <w:vAlign w:val="center"/>
             <w:tcMar>
-              <w:top w:w="70" w:type="dxa"/>
-              <w:left w:w="80" w:type="dxa"/>
-              <w:bottom w:w="70" w:type="dxa"/>
-              <w:right w:w="80" w:type="dxa"/>
+              <w:top w:w="90" w:type="dxa"/>
+              <w:start w:w="110" w:type="dxa"/>
+              <w:bottom w:w="90" w:type="dxa"/>
+              <w:end w:w="110" w:type="dxa"/>
             </w:tcMar>
-            <w:vAlign w:val="center"/>
           </w:tcPr>
           <w:p>
             <w:pPr>
-              <w:spacing w:after="0" w:line="240" w:lineRule="auto"/>
-              <w:rPr>
-                <w:rFonts w:cs="Times New Roman"/>
-              </w:rPr>
+              <w:spacing w:before="0" w:after="0" w:line="252" w:lineRule="auto"/>
+              <w:jc w:val="left"/>
             </w:pPr>
+            <w:r/>
             <w:r>
               <w:rPr>
-                <w:rFonts w:cs="Times New Roman"/>
-                <w:sz w:val="21"/>
-              </w:rPr>
-              <w:t>Màn hình 02 cột; sao chép nội dung và đường dẫn; mở kênh để người dùng dán thủ công; không tự điền hoặc tự đăng.</w:t>
+                <w:rFonts w:ascii="Times New Roman" w:hAnsi="Times New Roman" w:eastAsia="Times New Roman"/>
+                <w:b w:val="0"/>
+                <w:sz w:val="18"/>
+              </w:rPr>
+              <w:t>Cây tài liệu theo dự án với bảy nhánh nghiệp vụ và thư mục con; tải tệp hoặc lưu thẻ liên kết nguồn Google Drive; tìm kiếm và lọc theo dự án, loại, nguồn, trạng thái, nhãn quyền và hiệu lực. Có xem trước, tải bản có dấu nhận diện, mở nguồn, cảnh báo sắp hết hiệu lực, liên kết hỏng, gia hạn và duyệt theo quyền. Hệ thống không tự đồng bộ hoặc sao chép dữ liệu từ Google Drive.</w:t>
             </w:r>
           </w:p>
         </w:tc>
@@ -3524,87 +3533,85 @@
       <w:tr>
         <w:trPr>
           <w:cantSplit/>
-          <w:jc w:val="center"/>
         </w:trPr>
         <w:tc>
           <w:tcPr>
-            <w:tcW w:w="3343" w:type="dxa"/>
+            <w:tcW w:type="dxa" w:w="624"/>
+            <w:vAlign w:val="center"/>
             <w:tcMar>
-              <w:top w:w="70" w:type="dxa"/>
-              <w:left w:w="80" w:type="dxa"/>
-              <w:bottom w:w="70" w:type="dxa"/>
-              <w:right w:w="80" w:type="dxa"/>
+              <w:top w:w="90" w:type="dxa"/>
+              <w:start w:w="110" w:type="dxa"/>
+              <w:bottom w:w="90" w:type="dxa"/>
+              <w:end w:w="110" w:type="dxa"/>
             </w:tcMar>
-            <w:vAlign w:val="center"/>
           </w:tcPr>
           <w:p>
             <w:pPr>
-              <w:spacing w:after="0" w:line="240" w:lineRule="auto"/>
-              <w:rPr>
-                <w:rFonts w:cs="Times New Roman"/>
-              </w:rPr>
+              <w:spacing w:before="0" w:after="0" w:line="252" w:lineRule="auto"/>
+              <w:jc w:val="center"/>
             </w:pPr>
+            <w:r/>
             <w:r>
               <w:rPr>
-                <w:rFonts w:cs="Times New Roman"/>
-                <w:sz w:val="21"/>
-              </w:rPr>
-              <w:lastRenderedPageBreak/>
+                <w:rFonts w:ascii="Times New Roman" w:hAnsi="Times New Roman" w:eastAsia="Times New Roman"/>
+                <w:b w:val="0"/>
+                <w:sz w:val="18"/>
+              </w:rPr>
               <w:t>11</w:t>
             </w:r>
           </w:p>
         </w:tc>
         <w:tc>
           <w:tcPr>
-            <w:tcW w:w="3343" w:type="dxa"/>
+            <w:tcW w:type="dxa" w:w="2494"/>
+            <w:vAlign w:val="center"/>
             <w:tcMar>
-              <w:top w:w="70" w:type="dxa"/>
-              <w:left w:w="80" w:type="dxa"/>
-              <w:bottom w:w="70" w:type="dxa"/>
-              <w:right w:w="80" w:type="dxa"/>
+              <w:top w:w="90" w:type="dxa"/>
+              <w:start w:w="110" w:type="dxa"/>
+              <w:bottom w:w="90" w:type="dxa"/>
+              <w:end w:w="110" w:type="dxa"/>
             </w:tcMar>
-            <w:vAlign w:val="center"/>
           </w:tcPr>
           <w:p>
             <w:pPr>
-              <w:spacing w:after="0" w:line="240" w:lineRule="auto"/>
-              <w:rPr>
-                <w:rFonts w:cs="Times New Roman"/>
-              </w:rPr>
+              <w:spacing w:before="0" w:after="0" w:line="252" w:lineRule="auto"/>
+              <w:jc w:val="left"/>
             </w:pPr>
+            <w:r/>
             <w:r>
               <w:rPr>
-                <w:rFonts w:cs="Times New Roman"/>
-                <w:sz w:val="21"/>
-              </w:rPr>
-              <w:t>Duyệt mẫu</w:t>
+                <w:rFonts w:ascii="Times New Roman" w:hAnsi="Times New Roman" w:eastAsia="Times New Roman"/>
+                <w:b/>
+                <w:sz w:val="18"/>
+              </w:rPr>
+              <w:t>Bài đăng và thư viện mẫu</w:t>
             </w:r>
           </w:p>
         </w:tc>
         <w:tc>
           <w:tcPr>
-            <w:tcW w:w="3343" w:type="dxa"/>
+            <w:tcW w:type="dxa" w:w="6406"/>
+            <w:vAlign w:val="center"/>
             <w:tcMar>
-              <w:top w:w="70" w:type="dxa"/>
-              <w:left w:w="80" w:type="dxa"/>
-              <w:bottom w:w="70" w:type="dxa"/>
-              <w:right w:w="80" w:type="dxa"/>
+              <w:top w:w="90" w:type="dxa"/>
+              <w:start w:w="110" w:type="dxa"/>
+              <w:bottom w:w="90" w:type="dxa"/>
+              <w:end w:w="110" w:type="dxa"/>
             </w:tcMar>
-            <w:vAlign w:val="center"/>
           </w:tcPr>
           <w:p>
             <w:pPr>
-              <w:spacing w:after="0" w:line="240" w:lineRule="auto"/>
-              <w:rPr>
-                <w:rFonts w:cs="Times New Roman"/>
-              </w:rPr>
+              <w:spacing w:before="0" w:after="0" w:line="252" w:lineRule="auto"/>
+              <w:jc w:val="left"/>
             </w:pPr>
+            <w:r/>
             <w:r>
               <w:rPr>
-                <w:rFonts w:cs="Times New Roman"/>
-                <w:sz w:val="21"/>
-              </w:rPr>
-              <w:t>Luồng đề xuất và duyệt mẫu dùng chung; nội dung cá nhân giữ riêng theo chủ sở hữu.</w:t>
+                <w:rFonts w:ascii="Times New Roman" w:hAnsi="Times New Roman" w:eastAsia="Times New Roman"/>
+                <w:b w:val="0"/>
+                <w:sz w:val="18"/>
+              </w:rPr>
+              <w:t>Ba khu vực Mẫu chung, Mẫu của tôi và Đã gửi; tạo, sửa, tìm kiếm và lọc theo dự án, sản phẩm, loại mẫu, người tạo và trạng thái. Mẫu chung phải được người có quyền duyệt; mẫu cá nhân chỉ chủ sở hữu xem và có thể đề xuất nâng thành mẫu chung.</w:t>
             </w:r>
           </w:p>
         </w:tc>
@@ -3612,30 +3619,29 @@
       <w:tr>
         <w:trPr>
           <w:cantSplit/>
-          <w:jc w:val="center"/>
         </w:trPr>
         <w:tc>
           <w:tcPr>
-            <w:tcW w:w="3343" w:type="dxa"/>
+            <w:tcW w:type="dxa" w:w="624"/>
+            <w:vAlign w:val="center"/>
             <w:tcMar>
-              <w:top w:w="70" w:type="dxa"/>
-              <w:left w:w="80" w:type="dxa"/>
-              <w:bottom w:w="70" w:type="dxa"/>
-              <w:right w:w="80" w:type="dxa"/>
+              <w:top w:w="90" w:type="dxa"/>
+              <w:start w:w="110" w:type="dxa"/>
+              <w:bottom w:w="90" w:type="dxa"/>
+              <w:end w:w="110" w:type="dxa"/>
             </w:tcMar>
-            <w:vAlign w:val="center"/>
           </w:tcPr>
           <w:p>
             <w:pPr>
-              <w:spacing w:after="0" w:line="240" w:lineRule="auto"/>
-              <w:rPr>
-                <w:rFonts w:cs="Times New Roman"/>
-              </w:rPr>
+              <w:spacing w:before="0" w:after="0" w:line="252" w:lineRule="auto"/>
+              <w:jc w:val="center"/>
             </w:pPr>
+            <w:r/>
             <w:r>
               <w:rPr>
-                <w:rFonts w:cs="Times New Roman"/>
-                <w:sz w:val="21"/>
+                <w:rFonts w:ascii="Times New Roman" w:hAnsi="Times New Roman" w:eastAsia="Times New Roman"/>
+                <w:b w:val="0"/>
+                <w:sz w:val="18"/>
               </w:rPr>
               <w:t>12</w:t>
             </w:r>
@@ -3643,55 +3649,55 @@
         </w:tc>
         <w:tc>
           <w:tcPr>
-            <w:tcW w:w="3343" w:type="dxa"/>
+            <w:tcW w:type="dxa" w:w="2494"/>
+            <w:vAlign w:val="center"/>
             <w:tcMar>
-              <w:top w:w="70" w:type="dxa"/>
-              <w:left w:w="80" w:type="dxa"/>
-              <w:bottom w:w="70" w:type="dxa"/>
-              <w:right w:w="80" w:type="dxa"/>
+              <w:top w:w="90" w:type="dxa"/>
+              <w:start w:w="110" w:type="dxa"/>
+              <w:bottom w:w="90" w:type="dxa"/>
+              <w:end w:w="110" w:type="dxa"/>
             </w:tcMar>
-            <w:vAlign w:val="center"/>
           </w:tcPr>
           <w:p>
             <w:pPr>
-              <w:spacing w:after="0" w:line="240" w:lineRule="auto"/>
-              <w:rPr>
-                <w:rFonts w:cs="Times New Roman"/>
-              </w:rPr>
+              <w:spacing w:before="0" w:after="0" w:line="252" w:lineRule="auto"/>
+              <w:jc w:val="left"/>
             </w:pPr>
+            <w:r/>
             <w:r>
               <w:rPr>
-                <w:rFonts w:cs="Times New Roman"/>
-                <w:sz w:val="21"/>
-              </w:rPr>
-              <w:t>Kiểm thử</w:t>
+                <w:rFonts w:ascii="Times New Roman" w:hAnsi="Times New Roman" w:eastAsia="Times New Roman"/>
+                <w:b/>
+                <w:sz w:val="18"/>
+              </w:rPr>
+              <w:t>Soạn và chia sẻ bài</w:t>
             </w:r>
           </w:p>
         </w:tc>
         <w:tc>
           <w:tcPr>
-            <w:tcW w:w="3343" w:type="dxa"/>
+            <w:tcW w:type="dxa" w:w="6406"/>
+            <w:vAlign w:val="center"/>
             <w:tcMar>
-              <w:top w:w="70" w:type="dxa"/>
-              <w:left w:w="80" w:type="dxa"/>
-              <w:bottom w:w="70" w:type="dxa"/>
-              <w:right w:w="80" w:type="dxa"/>
+              <w:top w:w="90" w:type="dxa"/>
+              <w:start w:w="110" w:type="dxa"/>
+              <w:bottom w:w="90" w:type="dxa"/>
+              <w:end w:w="110" w:type="dxa"/>
             </w:tcMar>
-            <w:vAlign w:val="center"/>
           </w:tcPr>
           <w:p>
             <w:pPr>
-              <w:spacing w:after="0" w:line="240" w:lineRule="auto"/>
-              <w:rPr>
-                <w:rFonts w:cs="Times New Roman"/>
-              </w:rPr>
+              <w:spacing w:before="0" w:after="0" w:line="252" w:lineRule="auto"/>
+              <w:jc w:val="left"/>
             </w:pPr>
+            <w:r/>
             <w:r>
               <w:rPr>
-                <w:rFonts w:cs="Times New Roman"/>
-                <w:sz w:val="21"/>
-              </w:rPr>
-              <w:t>Kiểm thử quyền theo vai trò, luồng chính, biên nội dung công khai, hiển thị Web và lỗi trước bàn giao.</w:t>
+                <w:rFonts w:ascii="Times New Roman" w:hAnsi="Times New Roman" w:eastAsia="Times New Roman"/>
+                <w:b w:val="0"/>
+                <w:sz w:val="18"/>
+              </w:rPr>
+              <w:t>Chọn các khối nội dung công khai và tối đa một Sản phẩm Hot, sắp xếp và xem trước bài; sao chép nội dung hoặc tạo đường dẫn trang gửi khách. Hệ thống mở các kênh Zalo, Facebook, Batdongsan, Muaban, Homedy, Chợ Tốt và Alonhadat để người dùng dán thủ công; không tự điền biểu mẫu hoặc tự đăng. Trang gửi khách hiển thị đúng nội dung đã chọn và thông tin người phụ trách; đường dẫn có hạn và có thể bị vô hiệu hóa.</w:t>
             </w:r>
           </w:p>
         </w:tc>
@@ -3699,30 +3705,29 @@
       <w:tr>
         <w:trPr>
           <w:cantSplit/>
-          <w:jc w:val="center"/>
         </w:trPr>
         <w:tc>
           <w:tcPr>
-            <w:tcW w:w="3343" w:type="dxa"/>
+            <w:tcW w:type="dxa" w:w="624"/>
+            <w:vAlign w:val="center"/>
             <w:tcMar>
-              <w:top w:w="70" w:type="dxa"/>
-              <w:left w:w="80" w:type="dxa"/>
-              <w:bottom w:w="70" w:type="dxa"/>
-              <w:right w:w="80" w:type="dxa"/>
+              <w:top w:w="90" w:type="dxa"/>
+              <w:start w:w="110" w:type="dxa"/>
+              <w:bottom w:w="90" w:type="dxa"/>
+              <w:end w:w="110" w:type="dxa"/>
             </w:tcMar>
-            <w:vAlign w:val="center"/>
           </w:tcPr>
           <w:p>
             <w:pPr>
-              <w:spacing w:after="0" w:line="240" w:lineRule="auto"/>
-              <w:rPr>
-                <w:rFonts w:cs="Times New Roman"/>
-              </w:rPr>
+              <w:spacing w:before="0" w:after="0" w:line="252" w:lineRule="auto"/>
+              <w:jc w:val="center"/>
             </w:pPr>
+            <w:r/>
             <w:r>
               <w:rPr>
-                <w:rFonts w:cs="Times New Roman"/>
-                <w:sz w:val="21"/>
+                <w:rFonts w:ascii="Times New Roman" w:hAnsi="Times New Roman" w:eastAsia="Times New Roman"/>
+                <w:b w:val="0"/>
+                <w:sz w:val="18"/>
               </w:rPr>
               <w:t>13</w:t>
             </w:r>
@@ -3730,55 +3735,55 @@
         </w:tc>
         <w:tc>
           <w:tcPr>
-            <w:tcW w:w="3343" w:type="dxa"/>
+            <w:tcW w:type="dxa" w:w="2494"/>
+            <w:vAlign w:val="center"/>
             <w:tcMar>
-              <w:top w:w="70" w:type="dxa"/>
-              <w:left w:w="80" w:type="dxa"/>
-              <w:bottom w:w="70" w:type="dxa"/>
-              <w:right w:w="80" w:type="dxa"/>
+              <w:top w:w="90" w:type="dxa"/>
+              <w:start w:w="110" w:type="dxa"/>
+              <w:bottom w:w="90" w:type="dxa"/>
+              <w:end w:w="110" w:type="dxa"/>
             </w:tcMar>
-            <w:vAlign w:val="center"/>
           </w:tcPr>
           <w:p>
             <w:pPr>
-              <w:spacing w:after="0" w:line="240" w:lineRule="auto"/>
-              <w:rPr>
-                <w:rFonts w:cs="Times New Roman"/>
-              </w:rPr>
+              <w:spacing w:before="0" w:after="0" w:line="252" w:lineRule="auto"/>
+              <w:jc w:val="left"/>
             </w:pPr>
+            <w:r/>
             <w:r>
               <w:rPr>
-                <w:rFonts w:cs="Times New Roman"/>
-                <w:sz w:val="21"/>
-              </w:rPr>
-              <w:t>Dữ liệu mẫu và đào tạo</w:t>
+                <w:rFonts w:ascii="Times New Roman" w:hAnsi="Times New Roman" w:eastAsia="Times New Roman"/>
+                <w:b/>
+                <w:sz w:val="18"/>
+              </w:rPr>
+              <w:t>Quản trị nội dung và luồng duyệt</w:t>
             </w:r>
           </w:p>
         </w:tc>
         <w:tc>
           <w:tcPr>
-            <w:tcW w:w="3343" w:type="dxa"/>
+            <w:tcW w:type="dxa" w:w="6406"/>
+            <w:vAlign w:val="center"/>
             <w:tcMar>
-              <w:top w:w="70" w:type="dxa"/>
-              <w:left w:w="80" w:type="dxa"/>
-              <w:bottom w:w="70" w:type="dxa"/>
-              <w:right w:w="80" w:type="dxa"/>
+              <w:top w:w="90" w:type="dxa"/>
+              <w:start w:w="110" w:type="dxa"/>
+              <w:bottom w:w="90" w:type="dxa"/>
+              <w:end w:w="110" w:type="dxa"/>
             </w:tcMar>
-            <w:vAlign w:val="center"/>
           </w:tcPr>
           <w:p>
             <w:pPr>
-              <w:spacing w:after="0" w:line="240" w:lineRule="auto"/>
-              <w:rPr>
-                <w:rFonts w:cs="Times New Roman"/>
-              </w:rPr>
+              <w:spacing w:before="0" w:after="0" w:line="252" w:lineRule="auto"/>
+              <w:jc w:val="left"/>
             </w:pPr>
+            <w:r/>
             <w:r>
               <w:rPr>
-                <w:rFonts w:cs="Times New Roman"/>
-                <w:sz w:val="21"/>
-              </w:rPr>
-              <w:t>Cấu hình một bộ dữ liệu mẫu; hướng dẫn nhập liệu; 01 buổi đào tạo và bàn giao cho đầu mối Bên B.</w:t>
+                <w:rFonts w:ascii="Times New Roman" w:hAnsi="Times New Roman" w:eastAsia="Times New Roman"/>
+                <w:b w:val="0"/>
+                <w:sz w:val="18"/>
+              </w:rPr>
+              <w:t>Màn quản trị dự án, sản phẩm, Sản phẩm Hot, tài liệu, nhãn quyền, ngày hiệu lực và hàng chờ duyệt; duyệt, trả lại kèm lý do và theo dõi trạng thái. Người dùng có thể gửi đề nghị sửa nội dung; người phụ trách tiếp nhận, cập nhật và phản hồi trên hệ thống.</w:t>
             </w:r>
           </w:p>
         </w:tc>
@@ -3786,30 +3791,29 @@
       <w:tr>
         <w:trPr>
           <w:cantSplit/>
-          <w:jc w:val="center"/>
         </w:trPr>
         <w:tc>
           <w:tcPr>
-            <w:tcW w:w="3343" w:type="dxa"/>
+            <w:tcW w:type="dxa" w:w="624"/>
+            <w:vAlign w:val="center"/>
             <w:tcMar>
-              <w:top w:w="70" w:type="dxa"/>
-              <w:left w:w="80" w:type="dxa"/>
-              <w:bottom w:w="70" w:type="dxa"/>
-              <w:right w:w="80" w:type="dxa"/>
+              <w:top w:w="90" w:type="dxa"/>
+              <w:start w:w="110" w:type="dxa"/>
+              <w:bottom w:w="90" w:type="dxa"/>
+              <w:end w:w="110" w:type="dxa"/>
             </w:tcMar>
-            <w:vAlign w:val="center"/>
           </w:tcPr>
           <w:p>
             <w:pPr>
-              <w:spacing w:after="0" w:line="240" w:lineRule="auto"/>
-              <w:rPr>
-                <w:rFonts w:cs="Times New Roman"/>
-              </w:rPr>
+              <w:spacing w:before="0" w:after="0" w:line="252" w:lineRule="auto"/>
+              <w:jc w:val="center"/>
             </w:pPr>
+            <w:r/>
             <w:r>
               <w:rPr>
-                <w:rFonts w:cs="Times New Roman"/>
-                <w:sz w:val="21"/>
+                <w:rFonts w:ascii="Times New Roman" w:hAnsi="Times New Roman" w:eastAsia="Times New Roman"/>
+                <w:b w:val="0"/>
+                <w:sz w:val="18"/>
               </w:rPr>
               <w:t>14</w:t>
             </w:r>
@@ -3817,55 +3821,55 @@
         </w:tc>
         <w:tc>
           <w:tcPr>
-            <w:tcW w:w="3343" w:type="dxa"/>
+            <w:tcW w:type="dxa" w:w="2494"/>
+            <w:vAlign w:val="center"/>
             <w:tcMar>
-              <w:top w:w="70" w:type="dxa"/>
-              <w:left w:w="80" w:type="dxa"/>
-              <w:bottom w:w="70" w:type="dxa"/>
-              <w:right w:w="80" w:type="dxa"/>
+              <w:top w:w="90" w:type="dxa"/>
+              <w:start w:w="110" w:type="dxa"/>
+              <w:bottom w:w="90" w:type="dxa"/>
+              <w:end w:w="110" w:type="dxa"/>
             </w:tcMar>
-            <w:vAlign w:val="center"/>
           </w:tcPr>
           <w:p>
             <w:pPr>
-              <w:spacing w:after="0" w:line="240" w:lineRule="auto"/>
-              <w:rPr>
-                <w:rFonts w:cs="Times New Roman"/>
-              </w:rPr>
+              <w:spacing w:before="0" w:after="0" w:line="252" w:lineRule="auto"/>
+              <w:jc w:val="left"/>
             </w:pPr>
+            <w:r/>
             <w:r>
               <w:rPr>
-                <w:rFonts w:cs="Times New Roman"/>
-                <w:sz w:val="21"/>
-              </w:rPr>
-              <w:t>Quản lý dự án</w:t>
+                <w:rFonts w:ascii="Times New Roman" w:hAnsi="Times New Roman" w:eastAsia="Times New Roman"/>
+                <w:b/>
+                <w:sz w:val="18"/>
+              </w:rPr>
+              <w:t>Tìm kiếm, thông báo, kiểm thử và bàn giao</w:t>
             </w:r>
           </w:p>
         </w:tc>
         <w:tc>
           <w:tcPr>
-            <w:tcW w:w="3343" w:type="dxa"/>
+            <w:tcW w:type="dxa" w:w="6406"/>
+            <w:vAlign w:val="center"/>
             <w:tcMar>
-              <w:top w:w="70" w:type="dxa"/>
-              <w:left w:w="80" w:type="dxa"/>
-              <w:bottom w:w="70" w:type="dxa"/>
-              <w:right w:w="80" w:type="dxa"/>
+              <w:top w:w="90" w:type="dxa"/>
+              <w:start w:w="110" w:type="dxa"/>
+              <w:bottom w:w="90" w:type="dxa"/>
+              <w:end w:w="110" w:type="dxa"/>
             </w:tcMar>
-            <w:vAlign w:val="center"/>
           </w:tcPr>
           <w:p>
             <w:pPr>
-              <w:spacing w:after="0" w:line="240" w:lineRule="auto"/>
-              <w:rPr>
-                <w:rFonts w:cs="Times New Roman"/>
-              </w:rPr>
+              <w:spacing w:before="0" w:after="0" w:line="252" w:lineRule="auto"/>
+              <w:jc w:val="left"/>
             </w:pPr>
+            <w:r/>
             <w:r>
               <w:rPr>
-                <w:rFonts w:cs="Times New Roman"/>
-                <w:sz w:val="21"/>
-              </w:rPr>
-              <w:t>Họp, báo cáo tiến độ, quản lý yêu cầu và phối hợp trong 06 tuần triển khai.</w:t>
+                <w:rFonts w:ascii="Times New Roman" w:hAnsi="Times New Roman" w:eastAsia="Times New Roman"/>
+                <w:b w:val="0"/>
+                <w:sz w:val="18"/>
+              </w:rPr>
+              <w:t>Tìm kiếm trong phạm vi được cấp quyền; thông báo việc cần xử lý, nội dung được duyệt hoặc trả lại và tài liệu sắp hết hiệu lực. Bao gồm kiểm thử chức năng và phân quyền, cấu hình một bộ dữ liệu mẫu, sửa lỗi trước bàn giao, một buổi hướng dẫn sử dụng, tài liệu hướng dẫn ngắn gọn và phối hợp quản lý dự án trong 06 tuần.</w:t>
             </w:r>
           </w:p>
         </w:tc>
@@ -4143,16 +4147,10 @@
       </w:pPr>
       <w:r>
         <w:rPr>
-          <w:rFonts w:cs="Times New Roman"/>
-          <w:b/>
-        </w:rPr>
-        <w:t xml:space="preserve">- </w:t>
-      </w:r>
-      <w:r>
-        <w:rPr>
-          <w:rFonts w:cs="Times New Roman"/>
-        </w:rPr>
-        <w:t>Giai đoạn 1 không bao gồm: phiếu tính giá và lưới bảng hàng làm mô hình; bộ hỏi đáp 88 câu; kịch bản bán hàng MH-12; mẫu riêng từng kênh, lịch đăng hoặc tự đăng; báo cáo vận hành đầy đủ; nhập nội dung trực tiếp từ Google Drive; ứng dụng iOS/Android; CRM, giao dịch, doanh thu, hoa hồng, AI và các chức năng Giai đoạn 2.</w:t>
+          <w:rFonts w:ascii="Times New Roman" w:hAnsi="Times New Roman" w:eastAsia="Times New Roman"/>
+          <w:sz w:val="22"/>
+        </w:rPr>
+        <w:t>- Giai đoạn 1 không bao gồm: phiếu tính giá; lưới bảng hàng làm mô hình sản phẩm; hiển thị giá trong catalog; bộ hỏi đáp 88 câu; kịch bản bán hàng MH-12; mẫu riêng cho từng kênh, lịch đăng, tự điền biểu mẫu hoặc tự đăng lên kênh ngoài; biểu mẫu khách để lại thông tin và quản lý khách tiềm năng; tài khoản đăng nhập dành cho khách hàng; báo cáo vận hành chuyên sâu; tự đồng bộ hoặc nhập nội dung trực tiếp từ Google Drive; ứng dụng iOS/Android; CRM, giao dịch, doanh thu, hoa hồng, AI và các chức năng Giai đoạn 2.</w:t>
       </w:r>
     </w:p>
     <w:p>

</xml_diff>